<commit_message>
Ajusta o recorte para o 1º ao 5º ano em todos os capítulos e insere os dados de turmas e matrículas de 2026
Co-Authored-By: Claude Opus 5.5 <noreply@anthropic.com>
Claude-Session: https://claude.ai/code/session_01HxStpW4pQoDfJdTDYr6zEC
</commit_message>
<xml_diff>
--- a/agenda_pned_nova/5_AGENDA_GLOBAL_PNED_alinhada_ao_projeto.docx
+++ b/agenda_pned_nova/5_AGENDA_GLOBAL_PNED_alinhada_ao_projeto.docx
@@ -4179,7 +4179,7 @@
                 <w:szCs w:val="20"/>
                 <w:rtl w:val="0"/>
               </w:rPr>
-              <w:t xml:space="preserve">Põe a proteção de dados infantis como questão pedagógica, e não apenas técnica, na etapa da alfabetização</w:t>
+              <w:t xml:space="preserve">Põe a proteção de dados infantis como questão pedagógica, e não apenas técnica, nos anos iniciais</w:t>
             </w:r>
           </w:p>
         </w:tc>
@@ -10928,7 +10928,7 @@
         <w:rPr>
           <w:rtl w:val="0"/>
         </w:rPr>
-        <w:t xml:space="preserve">O cruzamento dessas fontes nos permite acompanhar a PNED no contexto da alfabetização nos anos iniciais. As perguntas que a comparação ajudou a formular se voltam para o modo como os profissionais da educação interpretam, traduzem e recontextualizam a política nas condições institucionais, materiais e territoriais em que atuam, e para as decisões que tomam quando parte dessas condições não chega.</w:t>
+        <w:t xml:space="preserve">O cruzamento dessas fontes nos permite acompanhar a PNED nos anos iniciais, do 1º ao 5º ano. As perguntas que a comparação ajudou a formular se voltam para o modo como os profissionais da educação interpretam, traduzem e recontextualizam a política nas condições institucionais, materiais e territoriais em que atuam, e para as decisões que tomam quando parte dessas condições não chega.</w:t>
       </w:r>
       <w:r>
         <w:rPr>

</xml_diff>

<commit_message>
Corrige a conformidade dos arquivos Word (medidas decimais, margem de encadernação e configurações), sem alterar o texto
Co-Authored-By: Claude Opus 5.5 <noreply@anthropic.com>
Claude-Session: https://claude.ai/code/session_01HxStpW4pQoDfJdTDYr6zEC
</commit_message>
<xml_diff>
--- a/agenda_pned_nova/5_AGENDA_GLOBAL_PNED_alinhada_ao_projeto.docx
+++ b/agenda_pned_nova/5_AGENDA_GLOBAL_PNED_alinhada_ao_projeto.docx
@@ -562,23 +562,23 @@
     <w:p>
       <w:pPr>
         <w:spacing w:after="0" w:before="0" w:line="240" w:lineRule="auto"/>
-        <w:ind w:left="2267.71653543307" w:firstLine="0"/>
-        <w:jc w:val="both"/>
-        <w:rPr>
-          <w:sz w:val="20"/>
-          <w:szCs w:val="20"/>
-        </w:rPr>
-      </w:pPr>
-      <w:r>
-        <w:rPr>
-          <w:rtl w:val="0"/>
-        </w:rPr>
-      </w:r>
-    </w:p>
-    <w:p>
-      <w:pPr>
-        <w:spacing w:after="0" w:before="0" w:line="240" w:lineRule="auto"/>
-        <w:ind w:left="2267.71653543307" w:firstLine="0"/>
+        <w:ind w:left="2268" w:firstLine="0"/>
+        <w:jc w:val="both"/>
+        <w:rPr>
+          <w:sz w:val="20"/>
+          <w:szCs w:val="20"/>
+        </w:rPr>
+      </w:pPr>
+      <w:r>
+        <w:rPr>
+          <w:rtl w:val="0"/>
+        </w:rPr>
+      </w:r>
+    </w:p>
+    <w:p>
+      <w:pPr>
+        <w:spacing w:after="0" w:before="0" w:line="240" w:lineRule="auto"/>
+        <w:ind w:left="2268" w:firstLine="0"/>
         <w:jc w:val="both"/>
         <w:rPr>
           <w:sz w:val="20"/>
@@ -610,23 +610,23 @@
     <w:p>
       <w:pPr>
         <w:spacing w:after="0" w:before="0" w:line="240" w:lineRule="auto"/>
-        <w:ind w:left="2267.71653543307" w:firstLine="0"/>
-        <w:jc w:val="both"/>
-        <w:rPr>
-          <w:sz w:val="20"/>
-          <w:szCs w:val="20"/>
-        </w:rPr>
-      </w:pPr>
-      <w:r>
-        <w:rPr>
-          <w:rtl w:val="0"/>
-        </w:rPr>
-      </w:r>
-    </w:p>
-    <w:p>
-      <w:pPr>
-        <w:spacing w:after="0" w:before="0" w:line="240" w:lineRule="auto"/>
-        <w:ind w:left="2267.71653543307" w:firstLine="0"/>
+        <w:ind w:left="2268" w:firstLine="0"/>
+        <w:jc w:val="both"/>
+        <w:rPr>
+          <w:sz w:val="20"/>
+          <w:szCs w:val="20"/>
+        </w:rPr>
+      </w:pPr>
+      <w:r>
+        <w:rPr>
+          <w:rtl w:val="0"/>
+        </w:rPr>
+      </w:r>
+    </w:p>
+    <w:p>
+      <w:pPr>
+        <w:spacing w:after="0" w:before="0" w:line="240" w:lineRule="auto"/>
+        <w:ind w:left="2268" w:firstLine="0"/>
         <w:jc w:val="both"/>
         <w:rPr>
           <w:sz w:val="20"/>
@@ -2169,7 +2169,7 @@
     <w:p>
       <w:pPr>
         <w:spacing w:after="0" w:before="0" w:line="240" w:lineRule="auto"/>
-        <w:ind w:left="2267.71653543307" w:firstLine="0"/>
+        <w:ind w:left="2268" w:firstLine="0"/>
         <w:jc w:val="both"/>
         <w:rPr>
           <w:sz w:val="20"/>
@@ -2202,7 +2202,7 @@
     <w:p>
       <w:pPr>
         <w:spacing w:after="0" w:before="0" w:line="240" w:lineRule="auto"/>
-        <w:ind w:left="2267.71653543307" w:firstLine="0"/>
+        <w:ind w:left="2268" w:firstLine="0"/>
         <w:jc w:val="both"/>
         <w:rPr>
           <w:sz w:val="20"/>
@@ -2219,7 +2219,7 @@
     <w:p>
       <w:pPr>
         <w:spacing w:after="0" w:before="0" w:line="240" w:lineRule="auto"/>
-        <w:ind w:left="2267.71653543307" w:firstLine="0"/>
+        <w:ind w:left="2268" w:firstLine="0"/>
         <w:jc w:val="both"/>
         <w:rPr>
           <w:sz w:val="20"/>
@@ -2480,23 +2480,23 @@
     <w:p>
       <w:pPr>
         <w:spacing w:after="0" w:before="0" w:line="240" w:lineRule="auto"/>
-        <w:ind w:left="2267.71653543307" w:firstLine="0"/>
-        <w:jc w:val="both"/>
-        <w:rPr>
-          <w:sz w:val="20"/>
-          <w:szCs w:val="20"/>
-        </w:rPr>
-      </w:pPr>
-      <w:r>
-        <w:rPr>
-          <w:rtl w:val="0"/>
-        </w:rPr>
-      </w:r>
-    </w:p>
-    <w:p>
-      <w:pPr>
-        <w:spacing w:after="0" w:before="0" w:line="240" w:lineRule="auto"/>
-        <w:ind w:left="2267.71653543307" w:firstLine="0"/>
+        <w:ind w:left="2268" w:firstLine="0"/>
+        <w:jc w:val="both"/>
+        <w:rPr>
+          <w:sz w:val="20"/>
+          <w:szCs w:val="20"/>
+        </w:rPr>
+      </w:pPr>
+      <w:r>
+        <w:rPr>
+          <w:rtl w:val="0"/>
+        </w:rPr>
+      </w:r>
+    </w:p>
+    <w:p>
+      <w:pPr>
+        <w:spacing w:after="0" w:before="0" w:line="240" w:lineRule="auto"/>
+        <w:ind w:left="2268" w:firstLine="0"/>
         <w:jc w:val="both"/>
         <w:rPr>
           <w:sz w:val="20"/>
@@ -2528,23 +2528,23 @@
     <w:p>
       <w:pPr>
         <w:spacing w:after="0" w:before="0" w:line="240" w:lineRule="auto"/>
-        <w:ind w:left="2267.71653543307" w:firstLine="0"/>
-        <w:jc w:val="both"/>
-        <w:rPr>
-          <w:sz w:val="20"/>
-          <w:szCs w:val="20"/>
-        </w:rPr>
-      </w:pPr>
-      <w:r>
-        <w:rPr>
-          <w:rtl w:val="0"/>
-        </w:rPr>
-      </w:r>
-    </w:p>
-    <w:p>
-      <w:pPr>
-        <w:spacing w:after="0" w:before="0" w:line="240" w:lineRule="auto"/>
-        <w:ind w:left="2267.71653543307" w:firstLine="0"/>
+        <w:ind w:left="2268" w:firstLine="0"/>
+        <w:jc w:val="both"/>
+        <w:rPr>
+          <w:sz w:val="20"/>
+          <w:szCs w:val="20"/>
+        </w:rPr>
+      </w:pPr>
+      <w:r>
+        <w:rPr>
+          <w:rtl w:val="0"/>
+        </w:rPr>
+      </w:r>
+    </w:p>
+    <w:p>
+      <w:pPr>
+        <w:spacing w:after="0" w:before="0" w:line="240" w:lineRule="auto"/>
+        <w:ind w:left="2268" w:firstLine="0"/>
         <w:jc w:val="both"/>
         <w:rPr>
           <w:sz w:val="20"/>
@@ -2620,39 +2620,39 @@
     <w:p>
       <w:pPr>
         <w:spacing w:after="0" w:before="0" w:line="240" w:lineRule="auto"/>
-        <w:ind w:left="2267.71653543307" w:firstLine="0"/>
-        <w:jc w:val="both"/>
-        <w:rPr>
-          <w:sz w:val="20"/>
-          <w:szCs w:val="20"/>
-        </w:rPr>
-      </w:pPr>
-      <w:r>
-        <w:rPr>
-          <w:rtl w:val="0"/>
-        </w:rPr>
-      </w:r>
-    </w:p>
-    <w:p>
-      <w:pPr>
-        <w:spacing w:after="0" w:before="0" w:line="240" w:lineRule="auto"/>
-        <w:ind w:left="2267.71653543307" w:firstLine="0"/>
-        <w:jc w:val="both"/>
-        <w:rPr>
-          <w:sz w:val="20"/>
-          <w:szCs w:val="20"/>
-        </w:rPr>
-      </w:pPr>
-      <w:r>
-        <w:rPr>
-          <w:rtl w:val="0"/>
-        </w:rPr>
-      </w:r>
-    </w:p>
-    <w:p>
-      <w:pPr>
-        <w:spacing w:after="0" w:before="0" w:line="240" w:lineRule="auto"/>
-        <w:ind w:left="2267.71653543307" w:firstLine="0"/>
+        <w:ind w:left="2268" w:firstLine="0"/>
+        <w:jc w:val="both"/>
+        <w:rPr>
+          <w:sz w:val="20"/>
+          <w:szCs w:val="20"/>
+        </w:rPr>
+      </w:pPr>
+      <w:r>
+        <w:rPr>
+          <w:rtl w:val="0"/>
+        </w:rPr>
+      </w:r>
+    </w:p>
+    <w:p>
+      <w:pPr>
+        <w:spacing w:after="0" w:before="0" w:line="240" w:lineRule="auto"/>
+        <w:ind w:left="2268" w:firstLine="0"/>
+        <w:jc w:val="both"/>
+        <w:rPr>
+          <w:sz w:val="20"/>
+          <w:szCs w:val="20"/>
+        </w:rPr>
+      </w:pPr>
+      <w:r>
+        <w:rPr>
+          <w:rtl w:val="0"/>
+        </w:rPr>
+      </w:r>
+    </w:p>
+    <w:p>
+      <w:pPr>
+        <w:spacing w:after="0" w:before="0" w:line="240" w:lineRule="auto"/>
+        <w:ind w:left="2268" w:firstLine="0"/>
         <w:jc w:val="both"/>
         <w:rPr/>
       </w:pPr>
@@ -2679,7 +2679,7 @@
     <w:p>
       <w:pPr>
         <w:spacing w:after="0" w:before="0" w:line="240" w:lineRule="auto"/>
-        <w:ind w:left="2267.71653543307" w:firstLine="0"/>
+        <w:ind w:left="2268" w:firstLine="0"/>
         <w:jc w:val="both"/>
         <w:rPr/>
       </w:pPr>
@@ -2734,23 +2734,23 @@
     <w:p>
       <w:pPr>
         <w:spacing w:after="0" w:before="0" w:line="240" w:lineRule="auto"/>
-        <w:ind w:left="2267.71653543307" w:firstLine="0"/>
-        <w:jc w:val="both"/>
-        <w:rPr>
-          <w:sz w:val="20"/>
-          <w:szCs w:val="20"/>
-        </w:rPr>
-      </w:pPr>
-      <w:r>
-        <w:rPr>
-          <w:rtl w:val="0"/>
-        </w:rPr>
-      </w:r>
-    </w:p>
-    <w:p>
-      <w:pPr>
-        <w:spacing w:after="0" w:before="0" w:line="240" w:lineRule="auto"/>
-        <w:ind w:left="2267.71653543307" w:firstLine="0"/>
+        <w:ind w:left="2268" w:firstLine="0"/>
+        <w:jc w:val="both"/>
+        <w:rPr>
+          <w:sz w:val="20"/>
+          <w:szCs w:val="20"/>
+        </w:rPr>
+      </w:pPr>
+      <w:r>
+        <w:rPr>
+          <w:rtl w:val="0"/>
+        </w:rPr>
+      </w:r>
+    </w:p>
+    <w:p>
+      <w:pPr>
+        <w:spacing w:after="0" w:before="0" w:line="240" w:lineRule="auto"/>
+        <w:ind w:left="2268" w:firstLine="0"/>
         <w:jc w:val="both"/>
         <w:rPr>
           <w:sz w:val="20"/>
@@ -2782,23 +2782,23 @@
     <w:p>
       <w:pPr>
         <w:spacing w:after="0" w:before="0" w:line="240" w:lineRule="auto"/>
-        <w:ind w:left="2267.71653543307" w:firstLine="0"/>
-        <w:jc w:val="both"/>
-        <w:rPr>
-          <w:sz w:val="20"/>
-          <w:szCs w:val="20"/>
-        </w:rPr>
-      </w:pPr>
-      <w:r>
-        <w:rPr>
-          <w:rtl w:val="0"/>
-        </w:rPr>
-      </w:r>
-    </w:p>
-    <w:p>
-      <w:pPr>
-        <w:spacing w:after="0" w:before="0" w:line="240" w:lineRule="auto"/>
-        <w:ind w:left="2267.71653543307" w:firstLine="0"/>
+        <w:ind w:left="2268" w:firstLine="0"/>
+        <w:jc w:val="both"/>
+        <w:rPr>
+          <w:sz w:val="20"/>
+          <w:szCs w:val="20"/>
+        </w:rPr>
+      </w:pPr>
+      <w:r>
+        <w:rPr>
+          <w:rtl w:val="0"/>
+        </w:rPr>
+      </w:r>
+    </w:p>
+    <w:p>
+      <w:pPr>
+        <w:spacing w:after="0" w:before="0" w:line="240" w:lineRule="auto"/>
+        <w:ind w:left="2268" w:firstLine="0"/>
         <w:jc w:val="both"/>
         <w:rPr>
           <w:sz w:val="20"/>
@@ -2969,7 +2969,7 @@
     <w:p>
       <w:pPr>
         <w:spacing w:after="0" w:before="0" w:line="240" w:lineRule="auto"/>
-        <w:ind w:left="2267.71653543307" w:firstLine="0"/>
+        <w:ind w:left="2268" w:firstLine="0"/>
         <w:jc w:val="both"/>
         <w:rPr>
           <w:sz w:val="20"/>
@@ -3001,7 +3001,7 @@
     <w:p>
       <w:pPr>
         <w:spacing w:after="0" w:before="0" w:line="240" w:lineRule="auto"/>
-        <w:ind w:left="2267.71653543307" w:firstLine="0"/>
+        <w:ind w:left="2268" w:firstLine="0"/>
         <w:jc w:val="both"/>
         <w:rPr>
           <w:sz w:val="20"/>
@@ -3396,23 +3396,23 @@
     <w:p>
       <w:pPr>
         <w:spacing w:after="0" w:before="0" w:line="240" w:lineRule="auto"/>
-        <w:ind w:left="2267.71653543307" w:firstLine="0"/>
-        <w:jc w:val="both"/>
-        <w:rPr>
-          <w:sz w:val="20"/>
-          <w:szCs w:val="20"/>
-        </w:rPr>
-      </w:pPr>
-      <w:r>
-        <w:rPr>
-          <w:rtl w:val="0"/>
-        </w:rPr>
-      </w:r>
-    </w:p>
-    <w:p>
-      <w:pPr>
-        <w:spacing w:after="0" w:before="0" w:line="240" w:lineRule="auto"/>
-        <w:ind w:left="2267.71653543307" w:firstLine="0"/>
+        <w:ind w:left="2268" w:firstLine="0"/>
+        <w:jc w:val="both"/>
+        <w:rPr>
+          <w:sz w:val="20"/>
+          <w:szCs w:val="20"/>
+        </w:rPr>
+      </w:pPr>
+      <w:r>
+        <w:rPr>
+          <w:rtl w:val="0"/>
+        </w:rPr>
+      </w:r>
+    </w:p>
+    <w:p>
+      <w:pPr>
+        <w:spacing w:after="0" w:before="0" w:line="240" w:lineRule="auto"/>
+        <w:ind w:left="2268" w:firstLine="0"/>
         <w:jc w:val="both"/>
         <w:rPr>
           <w:sz w:val="20"/>
@@ -3587,7 +3587,7 @@
     <w:tbl>
       <w:tblPr>
         <w:tblStyle w:val="Table1"/>
-        <w:tblW w:w="9072.0" w:type="dxa"/>
+        <w:tblW w:w="9072" w:type="dxa"/>
         <w:jc w:val="left"/>
         <w:tblBorders>
           <w:top w:color="000000" w:space="0" w:sz="4" w:val="single"/>
@@ -5933,7 +5933,7 @@
     <w:p>
       <w:pPr>
         <w:spacing w:after="0" w:before="0" w:line="240" w:lineRule="auto"/>
-        <w:ind w:left="2267.71653543307" w:firstLine="0"/>
+        <w:ind w:left="2268" w:firstLine="0"/>
         <w:jc w:val="both"/>
         <w:rPr>
           <w:sz w:val="20"/>
@@ -5976,23 +5976,23 @@
     <w:p>
       <w:pPr>
         <w:spacing w:after="0" w:before="0" w:line="240" w:lineRule="auto"/>
-        <w:ind w:left="2267.71653543307" w:firstLine="0"/>
-        <w:jc w:val="both"/>
-        <w:rPr>
-          <w:sz w:val="20"/>
-          <w:szCs w:val="20"/>
-        </w:rPr>
-      </w:pPr>
-      <w:r>
-        <w:rPr>
-          <w:rtl w:val="0"/>
-        </w:rPr>
-      </w:r>
-    </w:p>
-    <w:p>
-      <w:pPr>
-        <w:spacing w:after="0" w:before="0" w:line="240" w:lineRule="auto"/>
-        <w:ind w:left="2267.71653543307" w:firstLine="0"/>
+        <w:ind w:left="2268" w:firstLine="0"/>
+        <w:jc w:val="both"/>
+        <w:rPr>
+          <w:sz w:val="20"/>
+          <w:szCs w:val="20"/>
+        </w:rPr>
+      </w:pPr>
+      <w:r>
+        <w:rPr>
+          <w:rtl w:val="0"/>
+        </w:rPr>
+      </w:r>
+    </w:p>
+    <w:p>
+      <w:pPr>
+        <w:spacing w:after="0" w:before="0" w:line="240" w:lineRule="auto"/>
+        <w:ind w:left="2268" w:firstLine="0"/>
         <w:jc w:val="both"/>
         <w:rPr>
           <w:sz w:val="20"/>
@@ -6223,7 +6223,7 @@
     <w:p>
       <w:pPr>
         <w:spacing w:after="0" w:before="0" w:line="240" w:lineRule="auto"/>
-        <w:ind w:left="2267.71653543307" w:firstLine="0"/>
+        <w:ind w:left="2268" w:firstLine="0"/>
         <w:jc w:val="both"/>
         <w:rPr>
           <w:sz w:val="20"/>
@@ -6253,23 +6253,23 @@
     <w:p>
       <w:pPr>
         <w:spacing w:after="0" w:before="0" w:line="240" w:lineRule="auto"/>
-        <w:ind w:left="2267.71653543307" w:firstLine="0"/>
-        <w:jc w:val="both"/>
-        <w:rPr>
-          <w:sz w:val="20"/>
-          <w:szCs w:val="20"/>
-        </w:rPr>
-      </w:pPr>
-      <w:r>
-        <w:rPr>
-          <w:rtl w:val="0"/>
-        </w:rPr>
-      </w:r>
-    </w:p>
-    <w:p>
-      <w:pPr>
-        <w:spacing w:after="0" w:before="0" w:line="240" w:lineRule="auto"/>
-        <w:ind w:left="2267.71653543307" w:firstLine="0"/>
+        <w:ind w:left="2268" w:firstLine="0"/>
+        <w:jc w:val="both"/>
+        <w:rPr>
+          <w:sz w:val="20"/>
+          <w:szCs w:val="20"/>
+        </w:rPr>
+      </w:pPr>
+      <w:r>
+        <w:rPr>
+          <w:rtl w:val="0"/>
+        </w:rPr>
+      </w:r>
+    </w:p>
+    <w:p>
+      <w:pPr>
+        <w:spacing w:after="0" w:before="0" w:line="240" w:lineRule="auto"/>
+        <w:ind w:left="2268" w:firstLine="0"/>
         <w:jc w:val="both"/>
         <w:rPr>
           <w:sz w:val="20"/>
@@ -7725,23 +7725,23 @@
     <w:p>
       <w:pPr>
         <w:spacing w:after="0" w:before="0" w:line="240" w:lineRule="auto"/>
-        <w:ind w:left="2267.71653543307" w:firstLine="0"/>
-        <w:jc w:val="both"/>
-        <w:rPr>
-          <w:sz w:val="20"/>
-          <w:szCs w:val="20"/>
-        </w:rPr>
-      </w:pPr>
-      <w:r>
-        <w:rPr>
-          <w:rtl w:val="0"/>
-        </w:rPr>
-      </w:r>
-    </w:p>
-    <w:p>
-      <w:pPr>
-        <w:spacing w:after="0" w:before="0" w:line="240" w:lineRule="auto"/>
-        <w:ind w:left="2267.71653543307" w:firstLine="0"/>
+        <w:ind w:left="2268" w:firstLine="0"/>
+        <w:jc w:val="both"/>
+        <w:rPr>
+          <w:sz w:val="20"/>
+          <w:szCs w:val="20"/>
+        </w:rPr>
+      </w:pPr>
+      <w:r>
+        <w:rPr>
+          <w:rtl w:val="0"/>
+        </w:rPr>
+      </w:r>
+    </w:p>
+    <w:p>
+      <w:pPr>
+        <w:spacing w:after="0" w:before="0" w:line="240" w:lineRule="auto"/>
+        <w:ind w:left="2268" w:firstLine="0"/>
         <w:jc w:val="both"/>
         <w:rPr>
           <w:sz w:val="20"/>
@@ -7800,23 +7800,23 @@
     <w:p>
       <w:pPr>
         <w:spacing w:after="0" w:before="0" w:line="240" w:lineRule="auto"/>
-        <w:ind w:left="2267.71653543307" w:firstLine="0"/>
-        <w:jc w:val="both"/>
-        <w:rPr>
-          <w:sz w:val="20"/>
-          <w:szCs w:val="20"/>
-        </w:rPr>
-      </w:pPr>
-      <w:r>
-        <w:rPr>
-          <w:rtl w:val="0"/>
-        </w:rPr>
-      </w:r>
-    </w:p>
-    <w:p>
-      <w:pPr>
-        <w:spacing w:after="0" w:before="0" w:line="240" w:lineRule="auto"/>
-        <w:ind w:left="2267.71653543307" w:firstLine="0"/>
+        <w:ind w:left="2268" w:firstLine="0"/>
+        <w:jc w:val="both"/>
+        <w:rPr>
+          <w:sz w:val="20"/>
+          <w:szCs w:val="20"/>
+        </w:rPr>
+      </w:pPr>
+      <w:r>
+        <w:rPr>
+          <w:rtl w:val="0"/>
+        </w:rPr>
+      </w:r>
+    </w:p>
+    <w:p>
+      <w:pPr>
+        <w:spacing w:after="0" w:before="0" w:line="240" w:lineRule="auto"/>
+        <w:ind w:left="2268" w:firstLine="0"/>
         <w:jc w:val="both"/>
         <w:rPr>
           <w:sz w:val="20"/>
@@ -8168,7 +8168,7 @@
     <w:tbl>
       <w:tblPr>
         <w:tblStyle w:val="Table2"/>
-        <w:tblW w:w="9072.0" w:type="dxa"/>
+        <w:tblW w:w="9072" w:type="dxa"/>
         <w:jc w:val="left"/>
         <w:tblBorders>
           <w:top w:color="000000" w:space="0" w:sz="4" w:val="single"/>
@@ -10156,7 +10156,7 @@
     <w:tbl>
       <w:tblPr>
         <w:tblStyle w:val="Table3"/>
-        <w:tblW w:w="9072.0" w:type="dxa"/>
+        <w:tblW w:w="9072" w:type="dxa"/>
         <w:jc w:val="left"/>
         <w:tblBorders>
           <w:top w:color="000000" w:space="0" w:sz="4" w:val="single"/>
@@ -12040,7 +12040,7 @@
     <w:tbl>
       <w:tblPr>
         <w:tblStyle w:val="Table4"/>
-        <w:tblW w:w="9030.0" w:type="dxa"/>
+        <w:tblW w:w="9030" w:type="dxa"/>
         <w:jc w:val="left"/>
         <w:tblBorders>
           <w:top w:color="000000" w:space="0" w:sz="4" w:val="single"/>
@@ -13085,7 +13085,7 @@
       <w:tr>
         <w:trPr>
           <w:cantSplit w:val="0"/>
-          <w:trHeight w:val="932.9296875" w:hRule="atLeast"/>
+          <w:trHeight w:val="933" w:hRule="atLeast"/>
           <w:tblHeader w:val="0"/>
         </w:trPr>
         <w:tc>
@@ -13228,7 +13228,7 @@
       <w:tr>
         <w:trPr>
           <w:cantSplit w:val="0"/>
-          <w:trHeight w:val="932.9296875" w:hRule="atLeast"/>
+          <w:trHeight w:val="933" w:hRule="atLeast"/>
           <w:tblHeader w:val="0"/>
         </w:trPr>
         <w:tc>
@@ -13371,7 +13371,7 @@
       <w:tr>
         <w:trPr>
           <w:cantSplit w:val="0"/>
-          <w:trHeight w:val="932.9296875" w:hRule="atLeast"/>
+          <w:trHeight w:val="933" w:hRule="atLeast"/>
           <w:tblHeader w:val="0"/>
         </w:trPr>
         <w:tc>
@@ -14342,7 +14342,7 @@
     <w:tbl>
       <w:tblPr>
         <w:tblStyle w:val="Table5"/>
-        <w:tblW w:w="9030.0" w:type="dxa"/>
+        <w:tblW w:w="9030" w:type="dxa"/>
         <w:jc w:val="left"/>
         <w:tblBorders>
           <w:top w:color="000000" w:space="0" w:sz="0" w:val="nil"/>
@@ -14555,7 +14555,7 @@
       <w:tr>
         <w:trPr>
           <w:cantSplit w:val="0"/>
-          <w:trHeight w:val="1750.8593750000002" w:hRule="atLeast"/>
+          <w:trHeight w:val="1751" w:hRule="atLeast"/>
           <w:tblHeader w:val="0"/>
         </w:trPr>
         <w:tc>
@@ -16099,7 +16099,7 @@
     <w:tbl>
       <w:tblPr>
         <w:tblStyle w:val="Table5"/>
-        <w:tblW w:w="9030.0" w:type="dxa"/>
+        <w:tblW w:w="9030" w:type="dxa"/>
         <w:jc w:val="left"/>
         <w:tblBorders>
           <w:top w:color="000000" w:space="0" w:sz="0" w:val="nil"/>
@@ -16292,7 +16292,7 @@
       <w:tr>
         <w:trPr>
           <w:cantSplit w:val="0"/>
-          <w:trHeight w:val="1750.8593750000002" w:hRule="atLeast"/>
+          <w:trHeight w:val="1751" w:hRule="atLeast"/>
           <w:tblHeader w:val="0"/>
         </w:trPr>
         <w:tc>
@@ -16439,7 +16439,7 @@
       <w:tr>
         <w:trPr>
           <w:cantSplit w:val="0"/>
-          <w:trHeight w:val="1750.8593750000002" w:hRule="atLeast"/>
+          <w:trHeight w:val="1751" w:hRule="atLeast"/>
           <w:tblHeader w:val="0"/>
         </w:trPr>
         <w:tc>
@@ -16586,7 +16586,7 @@
       <w:tr>
         <w:trPr>
           <w:cantSplit w:val="0"/>
-          <w:trHeight w:val="1750.8593750000002" w:hRule="atLeast"/>
+          <w:trHeight w:val="1751" w:hRule="atLeast"/>
           <w:tblHeader w:val="0"/>
         </w:trPr>
         <w:tc>
@@ -16733,7 +16733,7 @@
       <w:tr>
         <w:trPr>
           <w:cantSplit w:val="0"/>
-          <w:trHeight w:val="1750.8593750000002" w:hRule="atLeast"/>
+          <w:trHeight w:val="1751" w:hRule="atLeast"/>
           <w:tblHeader w:val="0"/>
         </w:trPr>
         <w:tc>
@@ -16880,7 +16880,7 @@
       <w:tr>
         <w:trPr>
           <w:cantSplit w:val="0"/>
-          <w:trHeight w:val="1750.8593750000002" w:hRule="atLeast"/>
+          <w:trHeight w:val="1751" w:hRule="atLeast"/>
           <w:tblHeader w:val="0"/>
         </w:trPr>
         <w:tc>
@@ -17027,7 +17027,7 @@
       <w:tr>
         <w:trPr>
           <w:cantSplit w:val="0"/>
-          <w:trHeight w:val="1750.8593750000002" w:hRule="atLeast"/>
+          <w:trHeight w:val="1751" w:hRule="atLeast"/>
           <w:tblHeader w:val="0"/>
         </w:trPr>
         <w:tc>
@@ -17174,7 +17174,7 @@
       <w:tr>
         <w:trPr>
           <w:cantSplit w:val="0"/>
-          <w:trHeight w:val="1750.8593750000002" w:hRule="atLeast"/>
+          <w:trHeight w:val="1751" w:hRule="atLeast"/>
           <w:tblHeader w:val="0"/>
         </w:trPr>
         <w:tc>
@@ -21106,7 +21106,7 @@
       <w:headerReference r:id="rId46" w:type="default"/>
       <w:footerReference r:id="rId47" w:type="default"/>
       <w:pgSz w:h="16838" w:w="11906" w:orient="portrait"/>
-      <w:pgMar w:bottom="1134" w:top="1701" w:left="1701" w:right="1134" w:header="708" w:footer="708"/>
+      <w:pgMar w:bottom="1134" w:top="1701" w:left="1701" w:right="1134" w:header="708" w:footer="708" w:gutter="0"/>
       <w:pgNumType w:start="1"/>
     </w:sectPr>
   </w:body>

</xml_diff>

<commit_message>
Capítulo 5 alinhado à proposta: transições suavizadas, remissões a quadros corrigidas, Bowe, Ball e Gold com página e referências à esquerda
Co-Authored-By: Claude Opus 5.5 <noreply@anthropic.com>
Claude-Session: https://claude.ai/code/session_01HxStpW4pQoDfJdTDYr6zEC
</commit_message>
<xml_diff>
--- a/agenda_pned_nova/5_AGENDA_GLOBAL_PNED_alinhada_ao_projeto.docx
+++ b/agenda_pned_nova/5_AGENDA_GLOBAL_PNED_alinhada_ao_projeto.docx
@@ -124,7 +124,7 @@
         <w:rPr>
           <w:rtl w:val="0"/>
         </w:rPr>
-        <w:t>A Lei nº 14.533, de 11 de janeiro de 2023, é o resultado de décadas de decisões, disputas e recuos, no Brasil e fora dele, que transformaram a educação digital em assunto de política pública. Neste capítulo, reconstituímos esse percurso a partir de uma pergunta: que sentidos as políticas públicas atribuem às tecnologias digitais e como esses sentidos participam da constituição do texto da PNED? A pergunta corresponde aos contextos de influência e de produção do texto e importa para a questão norteadora, pois o texto da lei define o que se pede à escola e com que meios o direito à educação digital chega até ela. Sem esse exame, não seria possível saber em relação a quê os profissionais interpretam, traduzem, aderem, negociam ou resistem. Por isso, o capítulo oferece a base para os objetivos específicos (a), (c) e (d) da tese e informa o objetivo (b), todos respondidos no contexto da prática, e termina com uma síntese do que essa leitura leva para a investigação. Nossa leitura parte de uma posição explícita: a PNED amplia o que se exige das escolas sem assegurar, na mesma medida, os meios para cumprir essas exigências, e o capítulo mostra onde essa distância se inscreve no texto. No fim dessa cadeia de decisões está uma sala dos anos iniciais, com crianças de seis a dez anos e profissionais que precisam dar conta do que a lei pede.</w:t>
+        <w:t xml:space="preserve">A Lei nº 14.533, de 11 de janeiro de 2023, é o resultado de décadas de decisões, disputas e recuos, no Brasil e fora dele, que transformaram a educação digital em assunto de política pública. Reconstituímos esse percurso a partir de uma pergunta: que sentidos as políticas públicas atribuem às tecnologias digitais e como esses sentidos participam da constituição do texto da PNED? A pergunta corresponde aos contextos de influência e de produção do texto e importa para a questão norteadora, pois o texto da lei define o que se pede à escola e com que meios o direito à educação digital chega até ela. Sem esse exame, não seria possível saber em relação a quê os profissionais interpretam, traduzem, aderem, negociam ou resistem. Por isso, o capítulo oferece a base para os objetivos específicos (a), (c) e (d) da tese e informa o objetivo (b), todos respondidos no contexto da prática. Nossa leitura parte de uma posição explícita: a PNED amplia o que se exige das escolas sem assegurar, na mesma medida, os meios para cumprir essas exigências, e o capítulo mostra onde essa distância se inscreve no texto. No fim dessa cadeia de decisões está uma sala dos anos iniciais, com crianças de seis a dez anos e profissionais que precisam dar conta do que a lei pede.</w:t>
       </w:r>
     </w:p>
     <w:p>
@@ -238,7 +238,7 @@
         <w:rPr>
           <w:rtl w:val="0"/>
         </w:rPr>
-        <w:t xml:space="preserve">Lemos primeiro o que vem de fora do Brasil (seções 5.1 e 5.2), onde está o contexto de influência; depois, a história das políticas brasileiras (5.3); por fim, a própria lei e as normas em volta dela (5.4 e 5.5), onde está o contexto de produção do texto. Por esse caminho </w:t>
+        <w:t xml:space="preserve">O contexto de influência aparece no que vem de fora do Brasil, nas agendas internacionais e na perspectiva comparada (seções 5.1 e 5.2), e o contexto de produção do texto, na história das políticas brasileiras (5.3), na própria lei e nas normas em volta dela (5.4 e 5.5). Por esse caminho </w:t>
       </w:r>
       <w:r>
         <w:rPr>
@@ -653,13 +653,13 @@
         <w:rPr>
           <w:rtl w:val="0"/>
         </w:rPr>
-        <w:t xml:space="preserve">Embora o estudo da OCDE tenha como referência estudantes avaliados pelo PISA, dele podemos extrair uma questão pertinente para esta pesquisa, voltada aos anos iniciais do Ensino Fundamental: da presença dos computadores, por si só, não se pode inferir uma relação direta com o desempenho dos estudantes. O resultado chama atenção para o modo de uso dos recursos e para suas finalidades pedagógicas, questão ainda mais delicada quando se trata de crianças no começo da escolarização. Cabe registrar</w:t>
-      </w:r>
-      <w:r>
-        <w:rPr>
-          <w:rtl w:val="0"/>
-        </w:rPr>
-        <w:t xml:space="preserve">, ainda, que o estudo data de 2015 e que, desde então, vários países reformularam seus programas, como se verá adiante no caso argentino</w:t>
+        <w:t xml:space="preserve">Embora o estudo da OCDE tenha como referência estudantes avaliados pelo PISA, dele podemos extrair uma questão pertinente para esta pesquisa, voltada aos anos iniciais do Ensino Fundamental: da presença dos computadores, por si só, não se pode inferir uma relação direta com o desempenho dos estudantes. O resultado chama atenção para o modo de uso dos recursos e para suas finalidades pedagógicas, questão ainda mais delicada quando se trata de crianças no começo da escolarização. O estudo data de 2015, e desde então</w:t>
+      </w:r>
+      <w:r>
+        <w:rPr>
+          <w:rtl w:val="0"/>
+        </w:rPr>
+        <w:t xml:space="preserve"> vários países reformularam seus programas, como se verá adiante no caso argentino</w:t>
       </w:r>
       <w:r>
         <w:rPr>
@@ -2130,7 +2130,7 @@
         <w:rPr>
           <w:rtl w:val="0"/>
         </w:rPr>
-        <w:t xml:space="preserve">O currículo finlandês integra essa competência à multiliteracia e não cria para ela uma disciplina específica, forma de organização orientada para a integração entre áreas do conhecimento. A tecnologia deixa, assim, de aparecer apenas como conteúdo específico e passa a ser articulada a diferentes processos de aprendizagem.</w:t>
+        <w:t xml:space="preserve">O currículo finlandês integra essa competência à multiliteracia e não cria para ela uma disciplina específica, forma de organização orientada para a integração entre áreas do conhecimento. A tecnologia aparece, assim, articulada a diferentes processos de aprendizagem, além de figurar como conteúdo específico.</w:t>
       </w:r>
       <w:r>
         <w:rPr>
@@ -2244,13 +2244,13 @@
         <w:rPr>
           <w:rtl w:val="0"/>
         </w:rPr>
-        <w:t xml:space="preserve">A formulação francesa associa a educação digital à cidadania, ao espírito crítico e à educação para as mídias e a informação e, por isso, dialoga com o inciso III do eixo Educação Digital Escolar da PNED, especialmente por relacionar a cultura digital à formação cidadã e não apenas ao desenvolvimento de habilidades operacionais</w:t>
-      </w:r>
-      <w:r>
-        <w:rPr>
-          <w:rtl w:val="0"/>
-        </w:rPr>
-        <w:t xml:space="preserve">.</w:t>
+        <w:t xml:space="preserve">A formulação francesa associa a educação digital à cidadania, ao espírito crítico e à educação para as mídias e a informação e, por isso, dialoga com o inciso III do eixo Educação Digital Escolar da PNED, especialmente por relacionar a cultura digital à formação cidadã, para além do desenvolvimento de habilidades operacionais.</w:t>
+      </w:r>
+      <w:r>
+        <w:rPr>
+          <w:rtl w:val="0"/>
+        </w:rPr>
+        <w:t xml:space="preserve"/>
       </w:r>
     </w:p>
     <w:p>
@@ -6044,7 +6044,7 @@
         <w:rPr>
           <w:rtl w:val="0"/>
         </w:rPr>
-        <w:t xml:space="preserve">O DigComp 2.2 situa a competência digital entre as competências-chave para a aprendizagem ao longo da vida e reproduz da Recomendação do Conselho a definição dessas competências como essenciais para a realização pessoal, um estilo de vida saudável e sustentável, a empregabilidade, a cidadania ativa e a inclusão social (VUORIKARI; KLUZER; PUNIE, 2022, p. 6, tradução nossa). A competência digital deixa o terreno estritamente instrumental e passa a ser tratada como atributo da participação social. </w:t>
+        <w:t xml:space="preserve">O DigComp 2.2 situa a competência digital entre as competências-chave para a aprendizagem ao longo da vida e reproduz da Recomendação do Conselho a definição dessas competências como essenciais para a realização pessoal, um estilo de vida saudável e sustentável, a empregabilidade, a cidadania ativa e a inclusão social (VUORIKARI; KLUZER; PUNIE, 2022, p. 6, tradução nossa). A competência digital é tratada, assim, como atributo da participação social, além do terreno estritamente instrumental. </w:t>
       </w:r>
     </w:p>
     <w:p>
@@ -6134,31 +6134,31 @@
         <w:rPr>
           <w:rtl w:val="0"/>
         </w:rPr>
-        <w:t xml:space="preserve"> anos. A continuidade institucional é a categoria mais fraca do bloco: surge na passagem portuguesa do Plano Tecnológico da Educação à INCoDe.2030 e na transição desigual entre gerações de política, e só ganha densidade nas experiências americanas. Essas lições não descrevem a escola de Pipa</w:t>
-      </w:r>
-      <w:r>
-        <w:rPr>
-          <w:rtl w:val="0"/>
-        </w:rPr>
-        <w:t xml:space="preserve">, mas servem</w:t>
-      </w:r>
-      <w:r>
-        <w:rPr>
-          <w:rtl w:val="0"/>
-        </w:rPr>
-        <w:t xml:space="preserve"> de lente para compreender o trabalho dos </w:t>
-      </w:r>
-      <w:r>
-        <w:rPr>
-          <w:rtl w:val="0"/>
-        </w:rPr>
-        <w:t xml:space="preserve">profissionais da escola</w:t>
-      </w:r>
-      <w:r>
-        <w:rPr>
-          <w:rtl w:val="0"/>
-        </w:rPr>
-        <w:t xml:space="preserve"> quando interpretam o que a PNED lhes pede com os meios de que dispõem.</w:t>
+        <w:t xml:space="preserve"> anos. A continuidade institucional é a categoria mais fraca do bloco: surge na passagem portuguesa do Plano Tecnológico da Educação à INCoDe.2030 e na transição desigual entre gerações de política, e só ganha densidade nas experiências americanas. Essas lições servem de lente para compreender o trabalho dos profissionais da escola quando interpretam o que a PNED lhes pede com os meios de que dispõem, sem descrever a escola de Pipa.</w:t>
+      </w:r>
+      <w:r>
+        <w:rPr>
+          <w:rtl w:val="0"/>
+        </w:rPr>
+        <w:t xml:space="preserve"/>
+      </w:r>
+      <w:r>
+        <w:rPr>
+          <w:rtl w:val="0"/>
+        </w:rPr>
+        <w:t xml:space="preserve"/>
+      </w:r>
+      <w:r>
+        <w:rPr>
+          <w:rtl w:val="0"/>
+        </w:rPr>
+        <w:t xml:space="preserve"/>
+      </w:r>
+      <w:r>
+        <w:rPr>
+          <w:rtl w:val="0"/>
+        </w:rPr>
+        <w:t xml:space="preserve"/>
       </w:r>
     </w:p>
     <w:p>
@@ -6777,7 +6777,7 @@
         <w:rPr>
           <w:rtl w:val="0"/>
         </w:rPr>
-        <w:t xml:space="preserve">A própria organização dos três fossos constitui parte importante do argumento do plano, e fica ainda mais visível quando se compara com o título do plano, que enumera os fossos em sequência inversa, do acesso ao uso. No corpo do documento, o acesso vem por último, o que contraria a intuição corrente de que basta levar dispositivos e conectividade às escolas para que a educação digital aconteça. O acesso continua indispensável, pois sem ele nada começa, e passa a ser tratado como ponto de partida. Dois estudantes podem ter o mesmo aparelho e a mesma conexão e viver experiências educacionais muito desiguais, conforme um seja convidado a criar e o outro apenas a repetir. Essa inversão de prioridades, do acesso para o uso, é a contribuição mais aproveitável do NETP para esta análise. </w:t>
+        <w:t xml:space="preserve">A própria organização dos três fossos constitui parte importante do argumento do plano, e fica ainda mais visível quando se compara com o título do plano, que enumera os fossos em sequência inversa, do acesso ao uso. No corpo do documento, o acesso vem por último, o que contraria a intuição corrente de que basta levar dispositivos e conectividade às escolas para que a educação digital aconteça. O acesso continua indispensável, pois sem ele nada começa, e figura como ponto de partida. Dois estudantes podem ter o mesmo aparelho e a mesma conexão e viver experiências educacionais muito desiguais, conforme um seja convidado a criar e o outro apenas a repetir. Essa inversão de prioridades, do acesso para o uso, é a contribuição mais aproveitável do NETP para esta análise. </w:t>
       </w:r>
     </w:p>
     <w:p>
@@ -7991,7 +7991,7 @@
         <w:rPr>
           <w:rtl w:val="0"/>
         </w:rPr>
-        <w:t xml:space="preserve">A essa cadeia se vincula a PNED, instituída pela Lei nº 14.533, de 11 de janeiro de 2023, e estruturada pelo art. 1º, § 2º, em quatro eixos: inclusão digital; educação digital escolar; capacitação e especialização digital; e pesquisa e desenvolvimento em tecnologias da informação e comunicação. O eixo Educação Digital Escolar, recorte desta tese, e seus incisos serão examinados na seção 5.5 e detalhados no Quadro 5.</w:t>
+        <w:t xml:space="preserve">A essa cadeia se vincula a PNED, instituída pela Lei nº 14.533, de 11 de janeiro de 2023, e estruturada pelo art. 1º, § 2º, em quatro eixos: inclusão digital; educação digital escolar; capacitação e especialização digital; e pesquisa e desenvolvimento em tecnologias da informação e comunicação. O eixo Educação Digital Escolar, recorte desta tese, e seus incisos serão examinados na seção 5.5 e detalhados no Quadro 14.</w:t>
       </w:r>
     </w:p>
     <w:p>
@@ -10051,7 +10051,7 @@
         <w:rPr>
           <w:rtl w:val="0"/>
         </w:rPr>
-        <w:t xml:space="preserve">Reunidas, as recorrências dos dois blocos compõem as categorias sensibilizadoras do Quadro 4, que orientam a leitura dos documentos, do questionário, das entrevistas e do registro iconográfico na etapa empírica.</w:t>
+        <w:t xml:space="preserve">Reunidas, as recorrências dos dois blocos compõem as categorias sensibilizadoras do Quadro 12, que orientam a leitura dos documentos, do questionário, das entrevistas e do registro iconográfico na etapa empírica.</w:t>
       </w:r>
     </w:p>
     <w:p>
@@ -10969,7 +10969,7 @@
         <w:rPr>
           <w:rtl w:val="0"/>
         </w:rPr>
-        <w:t xml:space="preserve">Depois de percorrer os dois blocos, fica uma pergunta que nenhum dos casos responde por nós: o que acontece quando a PNED chega a uma escola onde parte das condições que esses países apontam como necessárias não está garantida? Antes de enfrentá-la, vale voltar ao que as duas leituras têm em comum.</w:t>
+        <w:t xml:space="preserve">Depois de percorrer os dois blocos, fica uma pergunta que nenhum dos casos responde por nós: o que acontece quando a PNED chega a uma escola onde parte das condições que esses países apontam como necessárias não está garantida? O que as duas leituras têm em comum ajuda a formulá-la.</w:t>
       </w:r>
     </w:p>
     <w:p>
@@ -11335,7 +11335,7 @@
         <w:rPr>
           <w:rtl w:val="0"/>
         </w:rPr>
-        <w:t xml:space="preserve"> ProInfo, criado oito anos depois, não revogou nem sucedeu formalmente o PRONINFE. Nenhum dos dois atos menciona o outro, e não há entre eles vínculo normativo. A continuidade que a literatura e os próprios materiais do Ministério estabelecem entre os dois programas é de ordem histórica, não jurídica. </w:t>
+        <w:t xml:space="preserve"> ProInfo, criado oito anos depois, não revogou nem sucedeu formalmente o PRONINFE. Nenhum dos dois atos menciona o outro, e não há entre eles vínculo normativo. A continuidade que a literatura e os próprios materiais do Ministério estabelecem entre os dois programas é de ordem histórica, sem amparo jurídico. </w:t>
       </w:r>
       <w:r>
         <w:rPr>
@@ -13662,19 +13662,19 @@
         <w:rPr>
           <w:rtl w:val="0"/>
         </w:rPr>
-        <w:t xml:space="preserve">Também ressaltam que os textos políticos não são necessariamente coerentes e claros e que por vezes apresentam contradições e empregam os termos-chave de diferentes maneiras, e</w:t>
-      </w:r>
-      <w:r>
-        <w:rPr>
-          <w:rtl w:val="0"/>
-        </w:rPr>
-        <w:t xml:space="preserve">, como vimos na Introdução, reconhecem que as políticas também carregam</w:t>
-      </w:r>
-      <w:r>
-        <w:rPr>
-          <w:rtl w:val="0"/>
-        </w:rPr>
-        <w:t xml:space="preserve"> restrições e possibilidades materiais</w:t>
+        <w:t xml:space="preserve">Também ressaltam que os textos políticos não são necessariamente coerentes e claros e que por vezes apresentam contradições e empregam os termos-chave de diferentes maneiras, e, como vimos na Introdução, reconhecem que as políticas “são intervenções textuais, mas carregam também restrições e possibilidades materiais” (BOWE; BALL; GOLD, 1992, p. 21, tradução nossa).</w:t>
+      </w:r>
+      <w:r>
+        <w:rPr>
+          <w:rtl w:val="0"/>
+        </w:rPr>
+        <w:t xml:space="preserve"/>
+      </w:r>
+      <w:r>
+        <w:rPr>
+          <w:rtl w:val="0"/>
+        </w:rPr>
+        <w:t xml:space="preserve"/>
       </w:r>
       <w:r>
         <w:rPr>
@@ -13686,7 +13686,7 @@
         <w:rPr>
           <w:rtl w:val="0"/>
         </w:rPr>
-        <w:t xml:space="preserve">. Essa observação orienta nossa leitura para as condições que cada norma cria, distribui ou deixa de criar.</w:t>
+        <w:t xml:space="preserve"> Essa observação orienta nossa leitura para as condições que cada norma cria, distribui ou deixa de criar.</w:t>
       </w:r>
       <w:r>
         <w:rPr>
@@ -17408,7 +17408,7 @@
     <w:p>
       <w:pPr>
         <w:spacing w:after="0" w:before="0" w:line="240" w:lineRule="auto"/>
-        <w:jc w:val="both"/>
+        <w:jc w:val="left"/>
         <w:rPr/>
       </w:pPr>
       <w:r>
@@ -17447,7 +17447,7 @@
     <w:p>
       <w:pPr>
         <w:spacing w:after="0" w:before="0" w:line="240" w:lineRule="auto"/>
-        <w:jc w:val="both"/>
+        <w:jc w:val="left"/>
         <w:rPr/>
       </w:pPr>
       <w:r>
@@ -17486,7 +17486,7 @@
     <w:p>
       <w:pPr>
         <w:spacing w:after="0" w:before="0" w:line="240" w:lineRule="auto"/>
-        <w:jc w:val="both"/>
+        <w:jc w:val="left"/>
         <w:rPr/>
       </w:pPr>
       <w:r>
@@ -17549,7 +17549,7 @@
     <w:p>
       <w:pPr>
         <w:spacing w:after="0" w:before="0" w:line="240" w:lineRule="auto"/>
-        <w:jc w:val="both"/>
+        <w:jc w:val="left"/>
         <w:rPr/>
       </w:pPr>
       <w:r>
@@ -17612,7 +17612,7 @@
     <w:p>
       <w:pPr>
         <w:spacing w:after="0" w:before="0" w:line="240" w:lineRule="auto"/>
-        <w:jc w:val="both"/>
+        <w:jc w:val="left"/>
         <w:rPr/>
       </w:pPr>
       <w:r>
@@ -17651,7 +17651,7 @@
     <w:p>
       <w:pPr>
         <w:spacing w:after="0" w:before="0" w:line="240" w:lineRule="auto"/>
-        <w:jc w:val="both"/>
+        <w:jc w:val="left"/>
         <w:rPr/>
       </w:pPr>
       <w:r>
@@ -17690,7 +17690,7 @@
     <w:p>
       <w:pPr>
         <w:spacing w:after="0" w:before="0" w:line="240" w:lineRule="auto"/>
-        <w:jc w:val="both"/>
+        <w:jc w:val="left"/>
         <w:rPr/>
       </w:pPr>
       <w:r>
@@ -17753,7 +17753,7 @@
     <w:p>
       <w:pPr>
         <w:spacing w:after="0" w:before="0" w:line="240" w:lineRule="auto"/>
-        <w:jc w:val="both"/>
+        <w:jc w:val="left"/>
         <w:rPr/>
       </w:pPr>
       <w:r>
@@ -17791,7 +17791,7 @@
     <w:p>
       <w:pPr>
         <w:spacing w:after="0" w:before="0" w:line="240" w:lineRule="auto"/>
-        <w:jc w:val="both"/>
+        <w:jc w:val="left"/>
         <w:rPr/>
       </w:pPr>
       <w:r>
@@ -17815,7 +17815,7 @@
     <w:p>
       <w:pPr>
         <w:spacing w:after="0" w:before="0" w:line="240" w:lineRule="auto"/>
-        <w:jc w:val="both"/>
+        <w:jc w:val="left"/>
         <w:rPr/>
       </w:pPr>
       <w:r>
@@ -17840,7 +17840,7 @@
     <w:p>
       <w:pPr>
         <w:spacing w:after="0" w:before="0" w:line="240" w:lineRule="auto"/>
-        <w:jc w:val="both"/>
+        <w:jc w:val="left"/>
         <w:rPr/>
       </w:pPr>
       <w:r>
@@ -17879,7 +17879,7 @@
     <w:p>
       <w:pPr>
         <w:spacing w:after="0" w:before="0" w:line="240" w:lineRule="auto"/>
-        <w:jc w:val="both"/>
+        <w:jc w:val="left"/>
         <w:rPr/>
       </w:pPr>
       <w:r>
@@ -17918,7 +17918,7 @@
     <w:p>
       <w:pPr>
         <w:spacing w:after="0" w:before="0" w:line="240" w:lineRule="auto"/>
-        <w:jc w:val="both"/>
+        <w:jc w:val="left"/>
         <w:rPr/>
       </w:pPr>
       <w:r>
@@ -17957,7 +17957,7 @@
     <w:p>
       <w:pPr>
         <w:spacing w:after="0" w:before="0" w:line="240" w:lineRule="auto"/>
-        <w:jc w:val="both"/>
+        <w:jc w:val="left"/>
         <w:rPr/>
       </w:pPr>
       <w:r>
@@ -17996,7 +17996,7 @@
     <w:p>
       <w:pPr>
         <w:spacing w:after="0" w:before="0" w:line="240" w:lineRule="auto"/>
-        <w:jc w:val="both"/>
+        <w:jc w:val="left"/>
         <w:rPr/>
       </w:pPr>
       <w:r>
@@ -18035,7 +18035,7 @@
     <w:p>
       <w:pPr>
         <w:spacing w:after="0" w:before="0" w:line="240" w:lineRule="auto"/>
-        <w:jc w:val="both"/>
+        <w:jc w:val="left"/>
         <w:rPr/>
       </w:pPr>
       <w:r>
@@ -18074,7 +18074,7 @@
     <w:p>
       <w:pPr>
         <w:spacing w:after="0" w:before="0" w:line="240" w:lineRule="auto"/>
-        <w:jc w:val="both"/>
+        <w:jc w:val="left"/>
         <w:rPr/>
       </w:pPr>
       <w:r>
@@ -18113,7 +18113,7 @@
     <w:p>
       <w:pPr>
         <w:spacing w:after="0" w:before="0" w:line="240" w:lineRule="auto"/>
-        <w:jc w:val="both"/>
+        <w:jc w:val="left"/>
         <w:rPr/>
       </w:pPr>
       <w:r>
@@ -18152,7 +18152,7 @@
     <w:p>
       <w:pPr>
         <w:spacing w:after="0" w:before="0" w:line="240" w:lineRule="auto"/>
-        <w:jc w:val="both"/>
+        <w:jc w:val="left"/>
         <w:rPr/>
       </w:pPr>
       <w:r>
@@ -18191,7 +18191,7 @@
     <w:p>
       <w:pPr>
         <w:spacing w:after="0" w:before="0" w:line="240" w:lineRule="auto"/>
-        <w:jc w:val="both"/>
+        <w:jc w:val="left"/>
         <w:rPr/>
       </w:pPr>
       <w:r>
@@ -18230,7 +18230,7 @@
     <w:p>
       <w:pPr>
         <w:spacing w:after="0" w:before="0" w:line="240" w:lineRule="auto"/>
-        <w:jc w:val="both"/>
+        <w:jc w:val="left"/>
         <w:rPr/>
       </w:pPr>
       <w:r>
@@ -18269,7 +18269,7 @@
     <w:p>
       <w:pPr>
         <w:spacing w:after="0" w:before="0" w:line="240" w:lineRule="auto"/>
-        <w:jc w:val="both"/>
+        <w:jc w:val="left"/>
         <w:rPr/>
       </w:pPr>
       <w:r>
@@ -18308,7 +18308,7 @@
     <w:p>
       <w:pPr>
         <w:spacing w:after="0" w:before="0" w:line="240" w:lineRule="auto"/>
-        <w:jc w:val="both"/>
+        <w:jc w:val="left"/>
         <w:rPr/>
       </w:pPr>
       <w:r>
@@ -18347,7 +18347,7 @@
     <w:p>
       <w:pPr>
         <w:spacing w:after="0" w:before="0" w:line="240" w:lineRule="auto"/>
-        <w:jc w:val="both"/>
+        <w:jc w:val="left"/>
         <w:rPr/>
       </w:pPr>
       <w:r>
@@ -18386,7 +18386,7 @@
     <w:p>
       <w:pPr>
         <w:spacing w:after="0" w:before="0" w:line="240" w:lineRule="auto"/>
-        <w:jc w:val="both"/>
+        <w:jc w:val="left"/>
         <w:rPr/>
       </w:pPr>
       <w:r>
@@ -18425,7 +18425,7 @@
     <w:p>
       <w:pPr>
         <w:spacing w:after="0" w:before="0" w:line="240" w:lineRule="auto"/>
-        <w:jc w:val="both"/>
+        <w:jc w:val="left"/>
         <w:rPr/>
       </w:pPr>
       <w:r>
@@ -18464,7 +18464,7 @@
     <w:p>
       <w:pPr>
         <w:spacing w:after="0" w:before="0" w:line="240" w:lineRule="auto"/>
-        <w:jc w:val="both"/>
+        <w:jc w:val="left"/>
         <w:rPr/>
       </w:pPr>
       <w:r>
@@ -18503,7 +18503,7 @@
     <w:p>
       <w:pPr>
         <w:spacing w:after="0" w:before="0" w:line="240" w:lineRule="auto"/>
-        <w:jc w:val="both"/>
+        <w:jc w:val="left"/>
         <w:rPr/>
       </w:pPr>
       <w:r>
@@ -18542,7 +18542,7 @@
     <w:p>
       <w:pPr>
         <w:spacing w:after="0" w:before="0" w:line="240" w:lineRule="auto"/>
-        <w:jc w:val="both"/>
+        <w:jc w:val="left"/>
         <w:rPr/>
       </w:pPr>
       <w:r>
@@ -18581,7 +18581,7 @@
     <w:p>
       <w:pPr>
         <w:spacing w:after="0" w:before="0" w:line="240" w:lineRule="auto"/>
-        <w:jc w:val="both"/>
+        <w:jc w:val="left"/>
         <w:rPr/>
       </w:pPr>
       <w:r>
@@ -18620,7 +18620,7 @@
     <w:p>
       <w:pPr>
         <w:spacing w:after="0" w:before="0" w:line="240" w:lineRule="auto"/>
-        <w:jc w:val="both"/>
+        <w:jc w:val="left"/>
         <w:rPr/>
       </w:pPr>
       <w:r>
@@ -18659,7 +18659,7 @@
     <w:p>
       <w:pPr>
         <w:spacing w:after="0" w:before="0" w:line="240" w:lineRule="auto"/>
-        <w:jc w:val="both"/>
+        <w:jc w:val="left"/>
         <w:rPr/>
       </w:pPr>
       <w:r>
@@ -18698,7 +18698,7 @@
     <w:p>
       <w:pPr>
         <w:spacing w:after="0" w:before="0" w:line="240" w:lineRule="auto"/>
-        <w:jc w:val="both"/>
+        <w:jc w:val="left"/>
         <w:rPr/>
       </w:pPr>
       <w:r>
@@ -18737,7 +18737,7 @@
     <w:p>
       <w:pPr>
         <w:spacing w:after="0" w:before="0" w:line="240" w:lineRule="auto"/>
-        <w:jc w:val="both"/>
+        <w:jc w:val="left"/>
         <w:rPr/>
       </w:pPr>
       <w:r>
@@ -18776,7 +18776,7 @@
     <w:p>
       <w:pPr>
         <w:spacing w:after="0" w:before="0" w:line="240" w:lineRule="auto"/>
-        <w:jc w:val="both"/>
+        <w:jc w:val="left"/>
         <w:rPr/>
       </w:pPr>
       <w:r>
@@ -18815,7 +18815,7 @@
     <w:p>
       <w:pPr>
         <w:spacing w:after="0" w:before="0" w:line="240" w:lineRule="auto"/>
-        <w:jc w:val="both"/>
+        <w:jc w:val="left"/>
         <w:rPr/>
       </w:pPr>
       <w:r>
@@ -18854,7 +18854,7 @@
     <w:p>
       <w:pPr>
         <w:spacing w:after="0" w:before="0" w:line="240" w:lineRule="auto"/>
-        <w:jc w:val="both"/>
+        <w:jc w:val="left"/>
         <w:rPr/>
       </w:pPr>
       <w:r>
@@ -18893,7 +18893,7 @@
     <w:p>
       <w:pPr>
         <w:spacing w:after="0" w:before="0" w:line="240" w:lineRule="auto"/>
-        <w:jc w:val="both"/>
+        <w:jc w:val="left"/>
         <w:rPr/>
       </w:pPr>
       <w:r>
@@ -18956,7 +18956,7 @@
     <w:p>
       <w:pPr>
         <w:spacing w:after="0" w:before="0" w:line="240" w:lineRule="auto"/>
-        <w:jc w:val="both"/>
+        <w:jc w:val="left"/>
         <w:rPr/>
       </w:pPr>
       <w:r>
@@ -18995,7 +18995,7 @@
     <w:p>
       <w:pPr>
         <w:spacing w:after="0" w:before="0" w:line="240" w:lineRule="auto"/>
-        <w:jc w:val="both"/>
+        <w:jc w:val="left"/>
         <w:rPr/>
       </w:pPr>
       <w:r>
@@ -19034,7 +19034,7 @@
     <w:p>
       <w:pPr>
         <w:spacing w:after="0" w:before="0" w:line="240" w:lineRule="auto"/>
-        <w:jc w:val="both"/>
+        <w:jc w:val="left"/>
         <w:rPr/>
       </w:pPr>
       <w:r>
@@ -19073,7 +19073,7 @@
     <w:p>
       <w:pPr>
         <w:spacing w:after="0" w:before="0" w:line="240" w:lineRule="auto"/>
-        <w:jc w:val="both"/>
+        <w:jc w:val="left"/>
         <w:rPr/>
       </w:pPr>
       <w:r>
@@ -19112,7 +19112,7 @@
     <w:p>
       <w:pPr>
         <w:spacing w:after="0" w:before="0" w:line="240" w:lineRule="auto"/>
-        <w:jc w:val="both"/>
+        <w:jc w:val="left"/>
         <w:rPr/>
       </w:pPr>
       <w:r>
@@ -19151,7 +19151,7 @@
     <w:p>
       <w:pPr>
         <w:spacing w:after="0" w:before="0" w:line="240" w:lineRule="auto"/>
-        <w:jc w:val="both"/>
+        <w:jc w:val="left"/>
         <w:rPr/>
       </w:pPr>
       <w:r>
@@ -19189,7 +19189,7 @@
     <w:p>
       <w:pPr>
         <w:spacing w:after="0" w:before="0" w:line="240" w:lineRule="auto"/>
-        <w:jc w:val="both"/>
+        <w:jc w:val="left"/>
         <w:rPr/>
       </w:pPr>
       <w:r>
@@ -19252,7 +19252,7 @@
     <w:p>
       <w:pPr>
         <w:spacing w:after="0" w:before="0" w:line="240" w:lineRule="auto"/>
-        <w:jc w:val="both"/>
+        <w:jc w:val="left"/>
         <w:rPr/>
       </w:pPr>
       <w:r>
@@ -19315,7 +19315,7 @@
     <w:p>
       <w:pPr>
         <w:spacing w:after="0" w:before="0" w:line="240" w:lineRule="auto"/>
-        <w:jc w:val="both"/>
+        <w:jc w:val="left"/>
         <w:rPr/>
       </w:pPr>
       <w:r>
@@ -19378,7 +19378,7 @@
     <w:p>
       <w:pPr>
         <w:spacing w:after="0" w:before="0" w:line="240" w:lineRule="auto"/>
-        <w:jc w:val="both"/>
+        <w:jc w:val="left"/>
         <w:rPr/>
       </w:pPr>
       <w:r>
@@ -19417,7 +19417,7 @@
     <w:p>
       <w:pPr>
         <w:spacing w:after="0" w:before="0" w:line="240" w:lineRule="auto"/>
-        <w:jc w:val="both"/>
+        <w:jc w:val="left"/>
         <w:rPr/>
       </w:pPr>
       <w:r>
@@ -19456,7 +19456,7 @@
     <w:p>
       <w:pPr>
         <w:spacing w:after="0" w:before="0" w:line="240" w:lineRule="auto"/>
-        <w:jc w:val="both"/>
+        <w:jc w:val="left"/>
         <w:rPr/>
       </w:pPr>
       <w:r>
@@ -19495,7 +19495,7 @@
     <w:p>
       <w:pPr>
         <w:spacing w:after="0" w:before="0" w:line="240" w:lineRule="auto"/>
-        <w:jc w:val="both"/>
+        <w:jc w:val="left"/>
         <w:rPr/>
       </w:pPr>
       <w:r>
@@ -19534,7 +19534,7 @@
     <w:p>
       <w:pPr>
         <w:spacing w:after="0" w:before="0" w:line="240" w:lineRule="auto"/>
-        <w:jc w:val="both"/>
+        <w:jc w:val="left"/>
         <w:rPr/>
       </w:pPr>
       <w:r>
@@ -19597,7 +19597,7 @@
     <w:p>
       <w:pPr>
         <w:spacing w:after="0" w:before="0" w:line="240" w:lineRule="auto"/>
-        <w:jc w:val="both"/>
+        <w:jc w:val="left"/>
         <w:rPr/>
       </w:pPr>
       <w:r>
@@ -19660,7 +19660,7 @@
     <w:p>
       <w:pPr>
         <w:spacing w:after="0" w:before="0" w:line="240" w:lineRule="auto"/>
-        <w:jc w:val="both"/>
+        <w:jc w:val="left"/>
         <w:rPr/>
       </w:pPr>
       <w:r>
@@ -19723,7 +19723,7 @@
     <w:p>
       <w:pPr>
         <w:spacing w:after="0" w:before="0" w:line="240" w:lineRule="auto"/>
-        <w:jc w:val="both"/>
+        <w:jc w:val="left"/>
         <w:rPr/>
       </w:pPr>
       <w:r>
@@ -19786,7 +19786,7 @@
     <w:p>
       <w:pPr>
         <w:spacing w:after="0" w:before="0" w:line="240" w:lineRule="auto"/>
-        <w:jc w:val="both"/>
+        <w:jc w:val="left"/>
         <w:rPr/>
       </w:pPr>
       <w:r>
@@ -19849,7 +19849,7 @@
     <w:p>
       <w:pPr>
         <w:spacing w:after="0" w:before="0" w:line="240" w:lineRule="auto"/>
-        <w:jc w:val="both"/>
+        <w:jc w:val="left"/>
         <w:rPr/>
       </w:pPr>
       <w:r>
@@ -19888,7 +19888,7 @@
     <w:p>
       <w:pPr>
         <w:spacing w:after="0" w:before="0" w:line="240" w:lineRule="auto"/>
-        <w:jc w:val="both"/>
+        <w:jc w:val="left"/>
         <w:rPr/>
       </w:pPr>
       <w:r>
@@ -19927,7 +19927,7 @@
     <w:p>
       <w:pPr>
         <w:spacing w:after="0" w:before="0" w:line="240" w:lineRule="auto"/>
-        <w:jc w:val="both"/>
+        <w:jc w:val="left"/>
         <w:rPr/>
       </w:pPr>
       <w:r>
@@ -19966,7 +19966,7 @@
     <w:p>
       <w:pPr>
         <w:spacing w:after="0" w:before="0" w:line="240" w:lineRule="auto"/>
-        <w:jc w:val="both"/>
+        <w:jc w:val="left"/>
         <w:rPr/>
       </w:pPr>
       <w:r>
@@ -20029,7 +20029,7 @@
     <w:p>
       <w:pPr>
         <w:spacing w:after="0" w:before="0" w:line="240" w:lineRule="auto"/>
-        <w:jc w:val="both"/>
+        <w:jc w:val="left"/>
         <w:rPr/>
       </w:pPr>
       <w:r>
@@ -20092,7 +20092,7 @@
     <w:p>
       <w:pPr>
         <w:spacing w:after="0" w:before="0" w:line="240" w:lineRule="auto"/>
-        <w:jc w:val="both"/>
+        <w:jc w:val="left"/>
         <w:rPr/>
       </w:pPr>
       <w:r>
@@ -20167,7 +20167,7 @@
     <w:p>
       <w:pPr>
         <w:spacing w:after="0" w:before="0" w:line="240" w:lineRule="auto"/>
-        <w:jc w:val="both"/>
+        <w:jc w:val="left"/>
         <w:rPr/>
       </w:pPr>
       <w:r>
@@ -20205,7 +20205,7 @@
     <w:p>
       <w:pPr>
         <w:spacing w:after="0" w:before="0" w:line="240" w:lineRule="auto"/>
-        <w:jc w:val="both"/>
+        <w:jc w:val="left"/>
         <w:rPr/>
       </w:pPr>
       <w:r>
@@ -20268,7 +20268,7 @@
     <w:p>
       <w:pPr>
         <w:spacing w:after="0" w:before="0" w:line="240" w:lineRule="auto"/>
-        <w:jc w:val="both"/>
+        <w:jc w:val="left"/>
         <w:rPr/>
       </w:pPr>
       <w:r>
@@ -20307,7 +20307,7 @@
     <w:p>
       <w:pPr>
         <w:spacing w:after="0" w:before="0" w:line="240" w:lineRule="auto"/>
-        <w:jc w:val="both"/>
+        <w:jc w:val="left"/>
         <w:rPr/>
       </w:pPr>
       <w:r>
@@ -20346,7 +20346,7 @@
     <w:p>
       <w:pPr>
         <w:spacing w:after="0" w:before="0" w:line="240" w:lineRule="auto"/>
-        <w:jc w:val="both"/>
+        <w:jc w:val="left"/>
         <w:rPr/>
       </w:pPr>
       <w:r>
@@ -20385,7 +20385,7 @@
     <w:p>
       <w:pPr>
         <w:spacing w:after="0" w:before="0" w:line="240" w:lineRule="auto"/>
-        <w:jc w:val="both"/>
+        <w:jc w:val="left"/>
         <w:rPr/>
       </w:pPr>
       <w:r>
@@ -20424,7 +20424,7 @@
     <w:p>
       <w:pPr>
         <w:spacing w:after="0" w:before="0" w:line="240" w:lineRule="auto"/>
-        <w:jc w:val="both"/>
+        <w:jc w:val="left"/>
         <w:rPr/>
       </w:pPr>
       <w:r>
@@ -20463,7 +20463,7 @@
     <w:p>
       <w:pPr>
         <w:spacing w:after="0" w:before="0" w:line="240" w:lineRule="auto"/>
-        <w:jc w:val="both"/>
+        <w:jc w:val="left"/>
         <w:rPr/>
       </w:pPr>
       <w:r>
@@ -20502,7 +20502,7 @@
     <w:p>
       <w:pPr>
         <w:spacing w:after="0" w:before="0" w:line="240" w:lineRule="auto"/>
-        <w:jc w:val="both"/>
+        <w:jc w:val="left"/>
         <w:rPr/>
       </w:pPr>
       <w:r>
@@ -20526,7 +20526,7 @@
     <w:p>
       <w:pPr>
         <w:spacing w:after="0" w:before="0" w:line="240" w:lineRule="auto"/>
-        <w:jc w:val="both"/>
+        <w:jc w:val="left"/>
         <w:rPr/>
       </w:pPr>
       <w:r>
@@ -20565,7 +20565,7 @@
     <w:p>
       <w:pPr>
         <w:spacing w:after="0" w:before="0" w:line="240" w:lineRule="auto"/>
-        <w:jc w:val="both"/>
+        <w:jc w:val="left"/>
         <w:rPr/>
       </w:pPr>
       <w:r>
@@ -20604,7 +20604,7 @@
     <w:p>
       <w:pPr>
         <w:spacing w:after="0" w:before="0" w:line="240" w:lineRule="auto"/>
-        <w:jc w:val="both"/>
+        <w:jc w:val="left"/>
         <w:rPr/>
       </w:pPr>
       <w:r>
@@ -20643,7 +20643,7 @@
     <w:p>
       <w:pPr>
         <w:spacing w:after="0" w:before="0" w:line="240" w:lineRule="auto"/>
-        <w:jc w:val="both"/>
+        <w:jc w:val="left"/>
         <w:rPr/>
       </w:pPr>
       <w:r>
@@ -20706,7 +20706,7 @@
     <w:p>
       <w:pPr>
         <w:spacing w:after="0" w:before="0" w:line="240" w:lineRule="auto"/>
-        <w:jc w:val="both"/>
+        <w:jc w:val="left"/>
         <w:rPr/>
       </w:pPr>
       <w:r>
@@ -20769,7 +20769,7 @@
     <w:p>
       <w:pPr>
         <w:spacing w:after="0" w:before="0" w:line="240" w:lineRule="auto"/>
-        <w:jc w:val="both"/>
+        <w:jc w:val="left"/>
         <w:rPr/>
       </w:pPr>
       <w:r>
@@ -20808,7 +20808,7 @@
     <w:p>
       <w:pPr>
         <w:spacing w:after="0" w:before="0" w:line="240" w:lineRule="auto"/>
-        <w:jc w:val="both"/>
+        <w:jc w:val="left"/>
         <w:rPr/>
       </w:pPr>
       <w:r>
@@ -20847,7 +20847,7 @@
     <w:p>
       <w:pPr>
         <w:spacing w:after="0" w:before="0" w:line="240" w:lineRule="auto"/>
-        <w:jc w:val="both"/>
+        <w:jc w:val="left"/>
         <w:rPr/>
       </w:pPr>
       <w:r>
@@ -20886,7 +20886,7 @@
     <w:p>
       <w:pPr>
         <w:spacing w:after="0" w:before="0" w:line="240" w:lineRule="auto"/>
-        <w:jc w:val="both"/>
+        <w:jc w:val="left"/>
         <w:rPr/>
       </w:pPr>
       <w:r>
@@ -20925,7 +20925,7 @@
     <w:p>
       <w:pPr>
         <w:spacing w:after="0" w:before="0" w:line="240" w:lineRule="auto"/>
-        <w:jc w:val="both"/>
+        <w:jc w:val="left"/>
         <w:rPr/>
       </w:pPr>
       <w:r>
@@ -20964,7 +20964,7 @@
     <w:p>
       <w:pPr>
         <w:spacing w:after="0" w:before="0" w:line="240" w:lineRule="auto"/>
-        <w:jc w:val="both"/>
+        <w:jc w:val="left"/>
         <w:rPr/>
       </w:pPr>
       <w:r>
@@ -21003,7 +21003,7 @@
     <w:p>
       <w:pPr>
         <w:spacing w:after="0" w:before="0" w:line="240" w:lineRule="auto"/>
-        <w:jc w:val="both"/>
+        <w:jc w:val="left"/>
         <w:rPr/>
       </w:pPr>
       <w:r>
@@ -21042,7 +21042,7 @@
     <w:p>
       <w:pPr>
         <w:spacing w:after="0" w:before="0" w:line="240" w:lineRule="auto"/>
-        <w:jc w:val="both"/>
+        <w:jc w:val="left"/>
         <w:rPr/>
       </w:pPr>
       <w:r>

</xml_diff>

<commit_message>
Referências e apêndices em ordem ABNT, em página nova, nos capítulos e no projeto; referências do capítulo 5 completadas
Co-Authored-By: Claude Opus 5.5 <noreply@anthropic.com>
Claude-Session: https://claude.ai/code/session_01HxStpW4pQoDfJdTDYr6zEC
</commit_message>
<xml_diff>
--- a/agenda_pned_nova/5_AGENDA_GLOBAL_PNED_alinhada_ao_projeto.docx
+++ b/agenda_pned_nova/5_AGENDA_GLOBAL_PNED_alinhada_ao_projeto.docx
@@ -13898,7 +13898,7 @@
         <w:rPr>
           <w:rtl w:val="0"/>
         </w:rPr>
-        <w:t xml:space="preserve">A esse quadro somou-se o Estatuto Digital da Criança e do Adolescente, instituído pela Lei nº 15.211, de 17 de setembro de 2025. O dispositivo original de vigência foi vetado, e a data de entrada em vigor foi posteriormente definida pela Lei nº 15.352, de 25 de fevereiro de 2026, que estabeleceu o início da vigência do Estatuto em 17 de março de 2026. A mesma lei alterou a estrutura da Autoridade Nacional de Proteção de Dados, transformando-a em Agência Nacional de Proteção de Dados, autarquia de natureza especial vinculada ao Ministério da Justiça e Segurança Pública.</w:t>
+        <w:t xml:space="preserve">A esse quadro somou-se o Estatuto Digital da Criança e do Adolescente, instituído pela Lei nº 15.211, de 17 de setembro de 2025. O dispositivo original de vigência foi vetado, e a data de entrada em vigor foi posteriormente definida pela Lei nº 15.352, de 25 de fevereiro de 2026 (BRASIL, 2026a), que estabeleceu o início da vigência do Estatuto em 17 de março de 2026. A mesma lei alterou a estrutura da Autoridade Nacional de Proteção de Dados, transformando-a em Agência Nacional de Proteção de Dados, autarquia de natureza especial vinculada ao Ministério da Justiça e Segurança Pública.</w:t>
       </w:r>
     </w:p>
     <w:p>
@@ -17371,9 +17371,11 @@
     </w:p>
     <w:p>
       <w:pPr>
-        <w:pStyle w:val="Heading2"/>
-        <w:spacing w:after="0" w:before="0" w:line="240" w:lineRule="auto"/>
-        <w:jc w:val="both"/>
+        <w:pStyle w:val="Heading1"/>
+        <w:pageBreakBefore/>
+        <w:spacing w:after="0" w:before="0" w:line="240" w:lineRule="auto"/>
+        <w:ind w:firstLine="0"/>
+        <w:jc w:val="center"/>
         <w:rPr>
           <w:rFonts w:ascii="Times New Roman" w:cs="Times New Roman" w:eastAsia="Times New Roman" w:hAnsi="Times New Roman"/>
           <w:b w:val="1"/>
@@ -17385,7 +17387,7 @@
       <w:r>
         <w:rPr>
           <w:rFonts w:ascii="Times New Roman" w:cs="Times New Roman" w:eastAsia="Times New Roman" w:hAnsi="Times New Roman"/>
-          <w:b w:val="1"/>
+          <w:b/>
           <w:bCs w:val="1"/>
           <w:sz w:val="26"/>
           <w:szCs w:val="26"/>
@@ -18861,6 +18863,31 @@
         <w:rPr>
           <w:rtl w:val="0"/>
         </w:rPr>
+        <w:t xml:space="preserve">BRASIL. Decreto nº 12.385, de 18 de fevereiro de 2025. Regulamenta a Lei nº 15.100, de 13 de janeiro de 2025. Brasília, DF: Presidência da República, 2025e.</w:t>
+      </w:r>
+    </w:p>
+    <w:p>
+      <w:pPr>
+        <w:spacing w:after="0" w:before="0" w:line="240" w:lineRule="auto"/>
+        <w:jc w:val="both"/>
+        <w:rPr/>
+      </w:pPr>
+      <w:r>
+        <w:rPr>
+          <w:rtl w:val="0"/>
+        </w:rPr>
+      </w:r>
+    </w:p>
+    <w:p>
+      <w:pPr>
+        <w:spacing w:after="0" w:before="0" w:line="240" w:lineRule="auto"/>
+        <w:jc w:val="left"/>
+        <w:rPr/>
+      </w:pPr>
+      <w:r>
+        <w:rPr>
+          <w:rtl w:val="0"/>
+        </w:rPr>
         <w:t xml:space="preserve">BRASIL. </w:t>
       </w:r>
       <w:r>
@@ -18875,7 +18902,32 @@
         <w:rPr>
           <w:rtl w:val="0"/>
         </w:rPr>
-        <w:t xml:space="preserve">. Transforma a Autoridade Nacional de Proteção de Dados em Agência Nacional de Proteção de Dados. Brasília, DF: Diário Oficial da União, 2026.</w:t>
+        <w:t>. Transforma a Autoridade Nacional de Proteção de Dados em Agência Nacional de Proteção de Dados. Brasília, DF: Diário Oficial da União, 2026a.</w:t>
+      </w:r>
+    </w:p>
+    <w:p>
+      <w:pPr>
+        <w:spacing w:after="0" w:before="0" w:line="240" w:lineRule="auto"/>
+        <w:jc w:val="both"/>
+        <w:rPr/>
+      </w:pPr>
+      <w:r>
+        <w:rPr>
+          <w:rtl w:val="0"/>
+        </w:rPr>
+      </w:r>
+    </w:p>
+    <w:p>
+      <w:pPr>
+        <w:spacing w:after="0" w:before="0" w:line="240" w:lineRule="auto"/>
+        <w:jc w:val="left"/>
+        <w:rPr/>
+      </w:pPr>
+      <w:r>
+        <w:rPr>
+          <w:rtl w:val="0"/>
+        </w:rPr>
+        <w:t xml:space="preserve">BRASIL. Lei nº 15.388, de 14 de abril de 2026. Aprova o Plano Nacional de Educação. Brasília, DF: Presidência da República, 2026b.</w:t>
       </w:r>
     </w:p>
     <w:p>
@@ -20314,7 +20366,7 @@
         <w:rPr>
           <w:rtl w:val="0"/>
         </w:rPr>
-        <w:t xml:space="preserve">MOROZOV, Evgeny. </w:t>
+        <w:t xml:space="preserve">NAVARRO ARREDONDO, Alejandro. Formación de agenda en la transición del programa Enciclomedia: hacia Habilidades Digitales para Todos. </w:t>
       </w:r>
       <w:r>
         <w:rPr>
@@ -20322,13 +20374,13 @@
           <w:bCs w:val="1"/>
           <w:rtl w:val="0"/>
         </w:rPr>
-        <w:t xml:space="preserve">Big Tech</w:t>
-      </w:r>
-      <w:r>
-        <w:rPr>
-          <w:rtl w:val="0"/>
-        </w:rPr>
-        <w:t xml:space="preserve">: a ascensão dos dados e a morte da política. São Paulo: Ubu Editora, 2018.</w:t>
+        <w:t xml:space="preserve">Revista Mexicana de Investigación Educativa</w:t>
+      </w:r>
+      <w:r>
+        <w:rPr>
+          <w:rtl w:val="0"/>
+        </w:rPr>
+        <w:t xml:space="preserve">, v. 16, n. 50, p. 699-723, jul./set. 2011.</w:t>
       </w:r>
     </w:p>
     <w:p>
@@ -20353,7 +20405,7 @@
         <w:rPr>
           <w:rtl w:val="0"/>
         </w:rPr>
-        <w:t xml:space="preserve">NAVARRO ARREDONDO, Alejandro. Formación de agenda en la transición del programa Enciclomedia: hacia Habilidades Digitales para Todos. </w:t>
+        <w:t xml:space="preserve">NIED. </w:t>
       </w:r>
       <w:r>
         <w:rPr>
@@ -20361,13 +20413,13 @@
           <w:bCs w:val="1"/>
           <w:rtl w:val="0"/>
         </w:rPr>
-        <w:t xml:space="preserve">Revista Mexicana de Investigación Educativa</w:t>
-      </w:r>
-      <w:r>
-        <w:rPr>
-          <w:rtl w:val="0"/>
-        </w:rPr>
-        <w:t xml:space="preserve">, v. 16, n. 50, p. 699-723, jul./set. 2011.</w:t>
+        <w:t xml:space="preserve">Histórico do Projeto EDUCOM</w:t>
+      </w:r>
+      <w:r>
+        <w:rPr>
+          <w:rtl w:val="0"/>
+        </w:rPr>
+        <w:t xml:space="preserve">. Campinas: Universidade Estadual de Campinas, 2024.</w:t>
       </w:r>
     </w:p>
     <w:p>
@@ -20392,7 +20444,7 @@
         <w:rPr>
           <w:rtl w:val="0"/>
         </w:rPr>
-        <w:t xml:space="preserve">NIED. </w:t>
+        <w:t xml:space="preserve">OCDE. </w:t>
       </w:r>
       <w:r>
         <w:rPr>
@@ -20400,13 +20452,13 @@
           <w:bCs w:val="1"/>
           <w:rtl w:val="0"/>
         </w:rPr>
-        <w:t xml:space="preserve">Histórico do Projeto EDUCOM</w:t>
-      </w:r>
-      <w:r>
-        <w:rPr>
-          <w:rtl w:val="0"/>
-        </w:rPr>
-        <w:t xml:space="preserve">. Campinas: Universidade Estadual de Campinas, 2024.</w:t>
+        <w:t xml:space="preserve">Students, computers and learning</w:t>
+      </w:r>
+      <w:r>
+        <w:rPr>
+          <w:rtl w:val="0"/>
+        </w:rPr>
+        <w:t xml:space="preserve">: making the connection. Paris: OECD Publishing, 2015.</w:t>
       </w:r>
     </w:p>
     <w:p>
@@ -20439,13 +20491,13 @@
           <w:bCs w:val="1"/>
           <w:rtl w:val="0"/>
         </w:rPr>
-        <w:t xml:space="preserve">Students, computers and learning</w:t>
-      </w:r>
-      <w:r>
-        <w:rPr>
-          <w:rtl w:val="0"/>
-        </w:rPr>
-        <w:t xml:space="preserve">: making the connection. Paris: OECD Publishing, 2015.</w:t>
+        <w:t xml:space="preserve">OECD Review of Digital Education Policy in the Netherlands</w:t>
+      </w:r>
+      <w:r>
+        <w:rPr>
+          <w:rtl w:val="0"/>
+        </w:rPr>
+        <w:t xml:space="preserve">. Paris: OECD Publishing, 2025. DOI: 10.1787/91118813-en.</w:t>
       </w:r>
     </w:p>
     <w:p>
@@ -20470,7 +20522,31 @@
         <w:rPr>
           <w:rtl w:val="0"/>
         </w:rPr>
-        <w:t xml:space="preserve">OCDE. </w:t>
+        <w:t>ONU. Comitê dos Direitos da Criança. Comentário Geral nº 25 (2021) sobre os direitos das crianças em relação ao ambiente digital. CRC/C/GC/25. Genebra: ONU, 2021.</w:t>
+      </w:r>
+    </w:p>
+    <w:p>
+      <w:pPr>
+        <w:spacing w:after="0" w:before="0" w:lineRule="auto"/>
+        <w:rPr/>
+      </w:pPr>
+      <w:r>
+        <w:rPr>
+          <w:rtl w:val="0"/>
+        </w:rPr>
+      </w:r>
+    </w:p>
+    <w:p>
+      <w:pPr>
+        <w:spacing w:after="0" w:before="0" w:line="240" w:lineRule="auto"/>
+        <w:jc w:val="left"/>
+        <w:rPr/>
+      </w:pPr>
+      <w:r>
+        <w:rPr>
+          <w:rtl w:val="0"/>
+        </w:rPr>
+        <w:t xml:space="preserve">PERU. Ministerio de Educación. </w:t>
       </w:r>
       <w:r>
         <w:rPr>
@@ -20478,13 +20554,13 @@
           <w:bCs w:val="1"/>
           <w:rtl w:val="0"/>
         </w:rPr>
-        <w:t xml:space="preserve">OECD Review of Digital Education Policy in the Netherlands</w:t>
-      </w:r>
-      <w:r>
-        <w:rPr>
-          <w:rtl w:val="0"/>
-        </w:rPr>
-        <w:t xml:space="preserve">. Paris: OECD Publishing, 2025. DOI: 10.1787/91118813-en.</w:t>
+        <w:t xml:space="preserve">Resolución Ministerial nº 0339-2009-ED</w:t>
+      </w:r>
+      <w:r>
+        <w:rPr>
+          <w:rtl w:val="0"/>
+        </w:rPr>
+        <w:t xml:space="preserve">. Autoriza a ejecución del Programa Una Laptop por Niño OLPC. Lima: Ministerio de Educación, 2009.</w:t>
       </w:r>
     </w:p>
     <w:p>
@@ -20509,31 +20585,7 @@
         <w:rPr>
           <w:rtl w:val="0"/>
         </w:rPr>
-        <w:t>ONU. Comitê dos Direitos da Criança. Comentário Geral nº 25 (2021) sobre os direitos das crianças em relação ao ambiente digital. CRC/C/GC/25. Genebra: ONU, 2021.</w:t>
-      </w:r>
-    </w:p>
-    <w:p>
-      <w:pPr>
-        <w:spacing w:after="0" w:before="0" w:lineRule="auto"/>
-        <w:rPr/>
-      </w:pPr>
-      <w:r>
-        <w:rPr>
-          <w:rtl w:val="0"/>
-        </w:rPr>
-      </w:r>
-    </w:p>
-    <w:p>
-      <w:pPr>
-        <w:spacing w:after="0" w:before="0" w:line="240" w:lineRule="auto"/>
-        <w:jc w:val="left"/>
-        <w:rPr/>
-      </w:pPr>
-      <w:r>
-        <w:rPr>
-          <w:rtl w:val="0"/>
-        </w:rPr>
-        <w:t xml:space="preserve">PERU. Ministerio de Educación. </w:t>
+        <w:t xml:space="preserve">PITTALUGA, Lucía; RIVOIR, Ana Laura. El Plan Ceibal en Uruguay: una innovación tecnológica y social. </w:t>
       </w:r>
       <w:r>
         <w:rPr>
@@ -20541,45 +20593,6 @@
           <w:bCs w:val="1"/>
           <w:rtl w:val="0"/>
         </w:rPr>
-        <w:t xml:space="preserve">Resolución Ministerial nº 0339-2009-ED</w:t>
-      </w:r>
-      <w:r>
-        <w:rPr>
-          <w:rtl w:val="0"/>
-        </w:rPr>
-        <w:t xml:space="preserve">. Autoriza a ejecución del Programa Una Laptop por Niño OLPC. Lima: Ministerio de Educación, 2009.</w:t>
-      </w:r>
-    </w:p>
-    <w:p>
-      <w:pPr>
-        <w:spacing w:after="0" w:before="0" w:line="240" w:lineRule="auto"/>
-        <w:jc w:val="both"/>
-        <w:rPr/>
-      </w:pPr>
-      <w:r>
-        <w:rPr>
-          <w:rtl w:val="0"/>
-        </w:rPr>
-      </w:r>
-    </w:p>
-    <w:p>
-      <w:pPr>
-        <w:spacing w:after="0" w:before="0" w:line="240" w:lineRule="auto"/>
-        <w:jc w:val="left"/>
-        <w:rPr/>
-      </w:pPr>
-      <w:r>
-        <w:rPr>
-          <w:rtl w:val="0"/>
-        </w:rPr>
-        <w:t xml:space="preserve">PITTALUGA, Lucía; RIVOIR, Ana Laura. El Plan Ceibal en Uruguay: una innovación tecnológica y social. </w:t>
-      </w:r>
-      <w:r>
-        <w:rPr>
-          <w:b w:val="1"/>
-          <w:bCs w:val="1"/>
-          <w:rtl w:val="0"/>
-        </w:rPr>
         <w:t xml:space="preserve">Revista Iberoamericana de Ciencia, Tecnología y Sociedad</w:t>
       </w:r>
       <w:r>
@@ -20587,45 +20600,6 @@
           <w:rtl w:val="0"/>
         </w:rPr>
         <w:t xml:space="preserve">, Buenos Aires, v. 7, n. 21, p. 147-160, 2012.</w:t>
-      </w:r>
-    </w:p>
-    <w:p>
-      <w:pPr>
-        <w:spacing w:after="0" w:before="0" w:line="240" w:lineRule="auto"/>
-        <w:jc w:val="both"/>
-        <w:rPr/>
-      </w:pPr>
-      <w:r>
-        <w:rPr>
-          <w:rtl w:val="0"/>
-        </w:rPr>
-      </w:r>
-    </w:p>
-    <w:p>
-      <w:pPr>
-        <w:spacing w:after="0" w:before="0" w:line="240" w:lineRule="auto"/>
-        <w:jc w:val="left"/>
-        <w:rPr/>
-      </w:pPr>
-      <w:r>
-        <w:rPr>
-          <w:rtl w:val="0"/>
-        </w:rPr>
-        <w:t xml:space="preserve">POELL, Thomas; NIEBORG, David; VAN DIJCK, José. Platformisation. </w:t>
-      </w:r>
-      <w:r>
-        <w:rPr>
-          <w:b w:val="1"/>
-          <w:bCs w:val="1"/>
-          <w:rtl w:val="0"/>
-        </w:rPr>
-        <w:t xml:space="preserve">Internet Policy Review</w:t>
-      </w:r>
-      <w:r>
-        <w:rPr>
-          <w:rtl w:val="0"/>
-        </w:rPr>
-        <w:t xml:space="preserve">, v. 8, n. 4, 2019.</w:t>
       </w:r>
     </w:p>
     <w:p>

</xml_diff>

<commit_message>
Ajusta o capítulo 5 à escala municipal e aos novos objetivos
Cadeia de tradução que passa pela Secretaria; vazio material lido
também na distribuição dos meios entre localidades; letras dos
objetivos remapeadas na síntese e no Quadro 15; ponte para o
capítulo 6 do município à escola.

Co-Authored-By: Claude Opus 5.5 <noreply@anthropic.com>
Claude-Session: https://claude.ai/code/session_01HxStpW4pQoDfJdTDYr6zEC
</commit_message>
<xml_diff>
--- a/agenda_pned_nova/5_AGENDA_GLOBAL_PNED_alinhada_ao_projeto.docx
+++ b/agenda_pned_nova/5_AGENDA_GLOBAL_PNED_alinhada_ao_projeto.docx
@@ -124,7 +124,7 @@
         <w:rPr>
           <w:rtl w:val="0"/>
         </w:rPr>
-        <w:t xml:space="preserve">A Lei nº 14.533, de 11 de janeiro de 2023, é o resultado de décadas de decisões, disputas e recuos, no Brasil e fora dele, que transformaram a educação digital em assunto de política pública. Reconstituímos esse percurso a partir de uma pergunta: que sentidos as políticas públicas atribuem às tecnologias digitais e como esses sentidos participam da constituição do texto da PNED? A pergunta corresponde aos contextos de influência e de produção do texto e importa para a questão norteadora, pois o texto da lei define o que se pede à escola e com que meios o direito à educação digital chega até ela. Sem esse exame, não seria possível saber em relação a quê os profissionais interpretam, traduzem, aderem, negociam ou resistem. Por isso, o capítulo oferece a base para os objetivos específicos (a), (c) e (d) da tese e informa o objetivo (b), todos respondidos no contexto da prática. Nossa leitura parte de uma posição explícita: a PNED amplia o que se exige das escolas sem assegurar, na mesma medida, os meios para cumprir essas exigências, e o capítulo mostra onde essa distância se inscreve no texto. No fim dessa cadeia de decisões está uma sala dos anos iniciais, com crianças de seis a dez anos e profissionais que precisam dar conta do que a lei pede.</w:t>
+        <w:t>A Lei nº 14.533, de 11 de janeiro de 2023, é o resultado de décadas de decisões, disputas e recuos, no Brasil e fora dele, que transformaram a educação digital em assunto de política pública. Reconstituímos esse percurso a partir de uma pergunta: que sentidos as políticas públicas atribuem às tecnologias digitais e como esses sentidos participam da constituição do texto da PNED? A pergunta corresponde aos contextos de influência e de produção do texto e importa para a questão norteadora, pois o texto da lei define o que se pede à escola e com que meios o direito à educação digital chega até ela. Sem esse exame, não seria possível saber em relação a quê os profissionais interpretam, traduzem, aderem, negociam ou resistem. Por isso, o capítulo oferece a base para os objetivos específicos (a), (b) e (d) da tese e informa o objetivo (c), todos respondidos no contexto da prática, da Secretaria Municipal de Educação à escola. Nossa leitura parte de uma posição explícita: a PNED amplia o que se exige das escolas sem assegurar, na mesma medida, os meios para cumprir essas exigências, e o capítulo mostra onde essa distância se inscreve no texto. No fim dessa cadeia de decisões, depois da rede municipal, está uma sala dos anos iniciais, com crianças de seis a dez anos e profissionais que precisam dar conta do que a lei pede.</w:t>
       </w:r>
     </w:p>
     <w:p>
@@ -264,7 +264,7 @@
         <w:rPr>
           <w:rtl w:val="0"/>
         </w:rPr>
-        <w:t>Cada documento foi estudado nas condições em que foi produzido, considerando os sentidos que ganha no interior das disputas e escolhas que atravessam a política educacional. Esse caminho nos leva ao objeto empírico da tese: o modo como o eixo Educação Digital Escolar, constituído no texto da PNED, será interpretado, traduzido e encenado no contexto de uma escola pública municipal, por profissionais da educação que ocupam diferentes posições na rede de ensino.</w:t>
+        <w:t>Cada documento foi estudado nas condições em que foi produzido, considerando os sentidos que ganha no interior das disputas e escolhas que atravessam a política educacional. Esse caminho nos leva ao objeto empírico da tese: o modo como o eixo Educação Digital Escolar, constituído no texto da PNED, será traduzido pela Secretaria Municipal de Educação de Tibau do Sul para a rede e, depois, interpretado, traduzido e encenado no contexto de uma escola pública municipal, por profissionais da educação que ocupam diferentes posições na rede de ensino.</w:t>
       </w:r>
     </w:p>
     <w:p>
@@ -6016,7 +6016,7 @@
         <w:rPr>
           <w:rtl w:val="0"/>
         </w:rPr>
-        <w:t xml:space="preserve">A escola decide, portanto, quando o município delega. Nesse modelo, a autonomia é uma forma de organizar a política, e parte das decisões fica com quem organiza o ensino. Para esta pesquisa, interessa-nos especialmente essa cadeia de tradução, da diretriz nacional à rede municipal e desta aos espaços escolares.</w:t>
+        <w:t>A escola decide, portanto, quando o município delega. Nesse modelo, a autonomia é uma forma de organizar a política, e parte das decisões fica com quem organiza o ensino. Para esta pesquisa, interessa-nos especialmente essa cadeia de tradução, da diretriz nacional à rede municipal e desta aos espaços escolares. Em Tibau do Sul, essa cadeia passa pela Secretaria Municipal de Educação, cuja tradução da PNED examinamos nos Capítulos 6 e 7.</w:t>
       </w:r>
     </w:p>
     <w:p>
@@ -6172,7 +6172,7 @@
         <w:rPr>
           <w:rtl w:val="0"/>
         </w:rPr>
-        <w:t xml:space="preserve">Da leitura europeia, levamos perguntas para o campo: em que condições a PNED chega, por quais mediações é atravessada e como é recebida, interpretada e recontextualizada quando encontra uma rede municipal de pequeno porte no litoral nordestino.</w:t>
+        <w:t>Da leitura europeia, levamos perguntas para o campo: em que condições a PNED chega, por quais mediações é atravessada e como é recebida, interpretada e recontextualizada quando encontra uma rede municipal de pequeno porte e diversa no litoral nordestino.</w:t>
       </w:r>
     </w:p>
     <w:p>
@@ -11081,37 +11081,7 @@
         <w:rPr>
           <w:rtl w:val="0"/>
         </w:rPr>
-        <w:t xml:space="preserve">Voltamos, então, à pergunta do início desta subseção. </w:t>
-      </w:r>
-      <w:r>
-        <w:rPr>
-          <w:rtl w:val="0"/>
-        </w:rPr>
-        <w:t xml:space="preserve">Partimos da compreensão de</w:t>
-      </w:r>
-      <w:r>
-        <w:rPr>
-          <w:rtl w:val="0"/>
-        </w:rPr>
-        <w:t xml:space="preserve"> que, quando parte das condições não chega, a decisão sobre como a política se realiza se desloca para os profissionais da escola, que </w:t>
-      </w:r>
-      <w:r>
-        <w:rPr>
-          <w:rtl w:val="0"/>
-        </w:rPr>
-        <w:t xml:space="preserve">interpretam e traduzem o que a lei pede com os recursos, os conhecimentos e o tempo de que dispõem, e que as culturas profissionais e o território de Pipa pesam nessa tradução. Examinaremos esse deslocamento</w:t>
-      </w:r>
-      <w:r>
-        <w:rPr>
-          <w:rtl w:val="0"/>
-        </w:rPr>
-        <w:t xml:space="preserve"> no contexto da prática, por meio das narrativas dos </w:t>
-      </w:r>
-      <w:r>
-        <w:rPr>
-          <w:rtl w:val="0"/>
-        </w:rPr>
-        <w:t xml:space="preserve">profissionais da educação da escola.</w:t>
+        <w:t>Voltamos, então, à pergunta do início desta subseção. Partimos da compreensão de que, quando parte das condições não chega, a decisão sobre como a política se realiza se desloca para a rede municipal e, dentro dela, para os profissionais da escola, que interpretam e traduzem o que a lei pede com os recursos, os conhecimentos e o tempo de que dispõem, e que as culturas profissionais, o território municipal e o de Pipa pesam nessa tradução. Examinaremos esse deslocamento no contexto da prática, por meio dos documentos e da entrevista do técnico da Secretaria e das narrativas dos profissionais da educação da escola.</w:t>
       </w:r>
     </w:p>
     <w:p>
@@ -13830,19 +13800,7 @@
         <w:rPr>
           <w:rtl w:val="0"/>
         </w:rPr>
-        <w:t xml:space="preserve">Com a transversalidade, parte das decisões sobre como pôr a cultura digital no currículo passa para os sistemas de ensino e para as escolas. Isso aproxima a análise da </w:t>
-      </w:r>
-      <w:r>
-        <w:rPr>
-          <w:rtl w:val="0"/>
-        </w:rPr>
-        <w:t xml:space="preserve">teoria da atuação, para a qual os profissionais da escola também fazem a política quando a interpretam e a traduzem em práticas (BALL; MAGUIRE; BRAUN, 2016)</w:t>
-      </w:r>
-      <w:r>
-        <w:rPr>
-          <w:rtl w:val="0"/>
-        </w:rPr>
-        <w:t xml:space="preserve">. Quando uma orientação curricular é ampla e as condições de sua realização são incertas, o que ela será na sala de aula se decide na escola. Como isso ocorre em Pipa é questão do campo, e não temos como pressupor, aqui, a forma desse processo.</w:t>
+        <w:t>Com a transversalidade, parte das decisões sobre como pôr a cultura digital no currículo passa para os sistemas de ensino e para as escolas. Isso aproxima a análise da teoria da atuação, para a qual os profissionais da escola também fazem a política quando a interpretam e a traduzem em práticas (BALL; MAGUIRE; BRAUN, 2016). Quando uma orientação curricular é ampla e as condições de sua realização são incertas, o que ela será na sala de aula se decide na escola. Como isso ocorre na rede de Tibau do Sul e na escola de Pipa é questão do campo, e não temos como pressupor, aqui, a forma desse processo.</w:t>
       </w:r>
     </w:p>
     <w:p>
@@ -15536,19 +15494,7 @@
         <w:rPr>
           <w:rtl w:val="0"/>
         </w:rPr>
-        <w:t xml:space="preserve">A falta de um mecanismo federativo obrigatório de financiamento abre espaço, na norma, para o que chamamos de vazio material. Equipamento, conexão, manutenção e formação estão previstos na lei, e sua chegada à escola depende da capacidade de cada rede de mobilizar dotações próprias e fontes setoriais. Numa rede municipal de pequeno porte, a exigência curricular tem data marcada (BRASIL, 2025a, art. 36), e os meios não têm. A falta, por sua vez, não se detém na Secretaria de Educação e chega à sala de aula, onde professores e equipe gestora continuam responsáveis pelo componente curricular, com ou sem os meios. Na prática, pode caber à professora decidir se a atividade de pensamento computacional será desplugada, com papel e objetos da sala, ou realizada no próprio celular dela. Se os meios não chegam, a decisão sobre como realizar o eixo passa a quem está na escola, com recursos, conhecimento e tempo próprios e com a sobrecarga daí decorrente. Nesse ponto, o financiamento se liga diretamente à </w:t>
-      </w:r>
-      <w:r>
-        <w:rPr>
-          <w:rtl w:val="0"/>
-        </w:rPr>
-        <w:t xml:space="preserve">encenação da política na escola e à pergunta sobre quem paga, no cotidiano, o preço dessa ausência</w:t>
-      </w:r>
-      <w:r>
-        <w:rPr>
-          <w:rtl w:val="0"/>
-        </w:rPr>
-        <w:t xml:space="preserve">. A experiência alemã adverte que nem um fundo federal vinculado, como o DigitalPakt Schule, garante execução homogênea entre os entes; sem um fundo desse tipo, a escola não dispõe sequer desse ponto de partida.</w:t>
+        <w:t>A falta de um mecanismo federativo obrigatório de financiamento abre espaço, na norma, para o que chamamos de vazio material. Equipamento, conexão, manutenção e formação estão previstos na lei, e sua chegada à escola depende da capacidade de cada rede de mobilizar dotações próprias e fontes setoriais. Numa rede municipal de pequeno porte, a exigência curricular tem data marcada (BRASIL, 2025a, art. 36), e os meios não têm. Num município com localidades tão distintas quanto as de Tibau do Sul, a Secretaria de Educação precisa, além disso, decidir como distribuir os meios que tem entre as escolas da sede, de Pipa, dos povoados rurais e de Sibaúma. A falta, por sua vez, não se detém na Secretaria e chega à sala de aula, onde professores e equipe gestora continuam responsáveis pelo componente curricular, com ou sem os meios. Na prática, pode caber à professora decidir se a atividade de pensamento computacional será desplugada, com papel e objetos da sala, ou realizada no próprio celular dela. Se os meios não chegam, a decisão sobre como realizar o eixo passa a quem está na escola, com recursos, conhecimento e tempo próprios e com a sobrecarga daí decorrente. Nesse ponto, o financiamento se liga diretamente à encenação da política na escola e à pergunta sobre quem paga, no cotidiano, o preço dessa ausência. A experiência alemã adverte que nem um fundo federal vinculado, como o DigitalPakt Schule, garante execução homogênea entre os entes; sem um fundo desse tipo, a escola não dispõe sequer desse ponto de partida.</w:t>
       </w:r>
     </w:p>
     <w:p>
@@ -15562,19 +15508,7 @@
         <w:rPr>
           <w:rtl w:val="0"/>
         </w:rPr>
-        <w:t xml:space="preserve">Esse encadeamento, contudo, é uma proposição a verificar. O desenho da lei cria as condições para o vazio material e não oferece remédio obrigatório contra ele. Caberá às narrativas e aos registros da rede, com os critérios fixados na seção 4.3, mostrar se o vazio se confirma na escola de Pipa e se </w:t>
-      </w:r>
-      <w:r>
-        <w:rPr>
-          <w:rtl w:val="0"/>
-        </w:rPr>
-        <w:t xml:space="preserve">as decisões dos profissionais decorrem</w:t>
-      </w:r>
-      <w:r>
-        <w:rPr>
-          <w:rtl w:val="0"/>
-        </w:rPr>
-        <w:t xml:space="preserve"> dele ou também da capacidade fiscal do município, das escolhas da gestão local e da descontinuidade dos programas. Para separar o desenho da lei da capacidade fiscal do município, precisaremos de um dado ainda não reunido: a receita de Tibau do Sul e o gasto municipal em educação no período [indicar dados do Siconfi/Finbra e anos]. Um município com boa arrecadação e sem os meios nas salas indica uma situação diferente da de um município sem recursos, e as duas leituras pedem respostas diferentes.</w:t>
+        <w:t>Esse encadeamento, contudo, é uma proposição a verificar. O desenho da lei cria as condições para o vazio material e não oferece remédio obrigatório contra ele. Caberá às narrativas e aos registros da rede, com os critérios fixados na seção 4.3, mostrar se o vazio se confirma na rede municipal e na escola de Pipa e se as decisões dos profissionais decorrem dele ou também da capacidade fiscal do município, das escolhas da gestão local e da descontinuidade dos programas. Para separar o desenho da lei da capacidade fiscal do município, precisaremos de um dado ainda não reunido: a receita de Tibau do Sul e o gasto municipal em educação no período [indicar dados do Siconfi/Finbra e anos]. Um município com boa arrecadação e sem os meios nas salas indica uma situação diferente da de um município sem recursos, e as duas leituras pedem respostas diferentes.</w:t>
       </w:r>
     </w:p>
     <w:p>
@@ -15886,43 +15820,7 @@
         <w:rPr>
           <w:rtl w:val="0"/>
         </w:rPr>
-        <w:t xml:space="preserve">O calendário normativo torna essa distância visível. A obrigação curricular foi promulgada em dezembro de 2023. Em março de 2025, a Resolução CNE/CEB nº 2/2025 determinou a elaboração dos novos currículos, acompanhados de plano de formação docente, ao longo daquele ano, com implementação obrigatória a partir de 2026 (BRASIL, 2025a, art. 36), e atribuiu aos sistemas de ensino e às instituições a definição e a implementação de estratégias de formação continuada dos profissionais para a educação digital e midiática (BRASIL, 2025a, art. 37). Para uma rede pequena, isso significa escrever currículo e plano de formação em um ano. A formação chega à rede municipal como atribuição, sem definição dos meios para cumpri-la nesses dispositivos. Quando ela não chega a tempo e a exigência permanece, o conhecimento passa a ser mais uma condição ausente, ao lado do equipamento e da conexão, e pede-se </w:t>
-      </w:r>
-      <w:r>
-        <w:rPr>
-          <w:rtl w:val="0"/>
-        </w:rPr>
-        <w:t xml:space="preserve">aos profissionais dos anos iniciais</w:t>
-      </w:r>
-      <w:r>
-        <w:rPr>
-          <w:rtl w:val="0"/>
-        </w:rPr>
-        <w:t xml:space="preserve"> o ensino de pensamento computacional e de direitos digitais a crianças de seis </w:t>
-      </w:r>
-      <w:r>
-        <w:rPr>
-          <w:rtl w:val="0"/>
-        </w:rPr>
-        <w:t xml:space="preserve">a dez</w:t>
-      </w:r>
-      <w:r>
-        <w:rPr>
-          <w:rtl w:val="0"/>
-        </w:rPr>
-        <w:t xml:space="preserve"> anos sem garantia de formação prévia nesses conteúdos. Não avaliamos o saber </w:t>
-      </w:r>
-      <w:r>
-        <w:rPr>
-          <w:rtl w:val="0"/>
-        </w:rPr>
-        <w:t xml:space="preserve">dos</w:t>
-      </w:r>
-      <w:r>
-        <w:rPr>
-          <w:rtl w:val="0"/>
-        </w:rPr>
-        <w:t xml:space="preserve"> profissionais; a leitura do texto permite afirmar algo sobre as condições oferecidas pela política para esse saber. A chegada das ações formativas à rede investigada, e sua data, é uma questão empírica, a ser examinada no Capítulo 7 pelos registros da Secretaria Municipal de Educação, pelo questionário e pelas entrevistas, conforme a seção 4.3.</w:t>
+        <w:t>O calendário normativo torna essa distância visível. A obrigação curricular foi promulgada em dezembro de 2023. Em março de 2025, a Resolução CNE/CEB nº 2/2025 determinou a elaboração dos novos currículos, acompanhados de plano de formação docente, ao longo daquele ano, com implementação obrigatória a partir de 2026 (BRASIL, 2025a, art. 36), e atribuiu aos sistemas de ensino e às instituições a definição e a implementação de estratégias de formação continuada dos profissionais para a educação digital e midiática (BRASIL, 2025a, art. 37). Para uma rede pequena, isso significa escrever currículo e plano de formação em um ano. A formação chega à rede municipal como atribuição, sem definição dos meios para cumpri-la nesses dispositivos. Quando ela não chega a tempo e a exigência permanece, o conhecimento passa a ser mais uma condição ausente, ao lado do equipamento e da conexão, e pede-se aos profissionais dos anos iniciais o ensino de pensamento computacional e de direitos digitais a crianças de seis a dez anos sem garantia de formação prévia nesses conteúdos. Não avaliamos o saber dos profissionais; a leitura do texto permite afirmar algo sobre as condições oferecidas pela política para esse saber. A chegada das ações formativas à rede investigada, e sua data, é uma questão empírica, a ser examinada nos Capítulos 6 e 7 pelos registros da Secretaria Municipal de Educação, pela entrevista com o técnico, pelo questionário e pelas entrevistas com os profissionais da escola, conforme a seção 4.3.</w:t>
       </w:r>
     </w:p>
     <w:p>
@@ -15987,7 +15885,7 @@
         <w:rPr>
           <w:rtl w:val="0"/>
         </w:rPr>
-        <w:t>A leitura documental alcança o texto da política e as condições que ele cria, e o que acontece na escola de Pipa fica para o campo. Dentro desse limite, ela entrega à tese uma das pontas da relação investigada. Se a forma assumida pela política no cotidiano escolar resulta do encontro entre o que ela prescreve e as condições sob as quais os profissionais atuam, este capítulo reconstituiu o primeiro termo desse encontro e mostrou onde, no próprio texto, as condições do segundo ficaram em aberto. Cada objetivo específico recebe daí uma contribuição própria.</w:t>
+        <w:t>A leitura documental alcança o texto da política e as condições que ele cria, e o que acontece na rede municipal e na escola de Pipa fica para o campo. Dentro desse limite, ela entrega à tese uma das pontas da relação investigada. Se a forma assumida pela política no cotidiano escolar resulta do encontro entre o que ela prescreve e as condições sob as quais os profissionais atuam, este capítulo reconstituiu o primeiro termo desse encontro e mostrou onde, no próprio texto, as condições do segundo ficaram em aberto. Cada objetivo específico recebe daí uma contribuição própria.</w:t>
       </w:r>
     </w:p>
     <w:p>
@@ -16001,7 +15899,7 @@
         <w:rPr>
           <w:rtl w:val="0"/>
         </w:rPr>
-        <w:t>Para o objetivo (a), o capítulo mostra que o eixo Educação Digital Escolar reúne num mesmo artigo finalidades de inclinação técnica, como o pensamento computacional e a programação, e de inclinação formativa e cidadã, como a cultura digital e os direitos digitais, sem hierarquia entre elas. Essa abertura é o espaço em que os profissionais vão interpretar a política. É nele que as culturas profissionais discutidas no Capítulo 4, isto é, o que uma equipe considera um bom trabalho, o que costuma acolher e os modos de relação entre seus membros, podem pesar sobre o que será priorizado e o que ficará de lado na escola.</w:t>
+        <w:t>Para o objetivo (b), o capítulo mostra que o eixo Educação Digital Escolar reúne num mesmo artigo finalidades de inclinação técnica, como o pensamento computacional e a programação, e de inclinação formativa e cidadã, como a cultura digital e os direitos digitais, sem hierarquia entre elas. Essa abertura é o espaço em que a Secretaria e os profissionais da escola vão interpretar a política. É nele que as culturas profissionais discutidas no Capítulo 4, isto é, o que uma equipe considera um bom trabalho, o que costuma acolher e os modos de relação entre seus membros, podem pesar sobre o que será priorizado e o que ficará de lado na escola.</w:t>
       </w:r>
     </w:p>
     <w:p>
@@ -16015,7 +15913,7 @@
         <w:rPr>
           <w:rtl w:val="0"/>
         </w:rPr>
-        <w:t>Para o objetivo (b), a contribuição está no desenho dos meios. A lei condiciona a inclusão digital aos limites orçamentários de cada ente, não cria fundo próprio nem transferência obrigatória aos municípios e trata a formação como ação de promoção, enquanto o componente curricular se tornou obrigatório e ganhou data para entrar nos currículos. Numa rede de pequeno porte, esse desenho torna possível o que chamamos de vazio material. A prioridade às populações mais vulneráveis, inscrita no art. 1º, oferece o critério para ler o caso: se a política é delas, as redes e as escolas com menos recursos deveriam ser as primeiras a receber os meios, e o Capítulo 6 documenta em que condições a escola de Pipa os espera. A perspectiva comparada reforça essa leitura, pois nos casos americanos pesam justamente as desigualdades territoriais, a escala dos programas e a instabilidade institucional.</w:t>
+        <w:t>Para os objetivos (a) e (c), a contribuição está no desenho dos meios. A lei condiciona a inclusão digital aos limites orçamentários de cada ente, não cria fundo próprio nem transferência obrigatória aos municípios e trata a formação como ação de promoção, enquanto o componente curricular se tornou obrigatório e ganhou data para entrar nos currículos. Numa rede de pequeno porte, esse desenho torna possível o que chamamos de vazio material. A prioridade às populações mais vulneráveis, inscrita no art. 1º, oferece o critério para ler o caso: se a política é delas, as redes e as escolas com menos recursos deveriam ser as primeiras a receber os meios, e, dentro de uma rede, as localidades com menos meios. O Capítulo 6 examina como a Secretaria trata essas diferenças e documenta em que condições a escola de Pipa espera os meios. A perspectiva comparada reforça essa leitura, pois nos casos americanos pesam justamente as desigualdades territoriais, a escala dos programas e a instabilidade institucional.</w:t>
       </w:r>
     </w:p>
     <w:p>
@@ -16029,7 +15927,7 @@
         <w:rPr>
           <w:rtl w:val="0"/>
         </w:rPr>
-        <w:t>Para o objetivo (c), o capítulo identifica no texto e na história das políticas as situações em que diferentes formas de atuação podem surgir, sem antecipar qual delas se verá na escola. Os espaços que a lei deixa abertos pedem tradução. A trajetória brasileira registra lacunas cobertas dentro das próprias escolas, como a manutenção dos laboratórios entregue aos professores que mais entendiam de informática. Os instrumentos de autodiagnóstico e de monitoramento previstos entre as estratégias do eixo podem trazer exigências de registro e de evidência, no sentido da performatividade descrita por Ball (2008). As normas editadas entre 2025 e 2026, por fim, acrescentam aos mesmos profissionais demandas de proteção, de controle dos aparelhos pessoais e de notificação, que precisam ser conciliadas com o uso pedagógico das tecnologias. Adesão, acomodação, adaptação, omissão seletiva, negociação, ressignificação e resistência encontram, nesse quadro, condições para aparecer, e somente as narrativas dirão quais aparecem de fato, em que condições e por quê.</w:t>
+        <w:t>Para o objetivo (d), o capítulo identifica no texto e na história das políticas as situações em que diferentes formas de atuação podem surgir, sem antecipar qual delas se verá na escola. Os espaços que a lei deixa abertos pedem tradução. A trajetória brasileira registra lacunas cobertas dentro das próprias escolas, como a manutenção dos laboratórios entregue aos professores que mais entendiam de informática. Os instrumentos de autodiagnóstico e de monitoramento previstos entre as estratégias do eixo podem trazer exigências de registro e de evidência, no sentido da performatividade descrita por Ball (2008). As normas editadas entre 2025 e 2026, por fim, acrescentam aos mesmos profissionais demandas de proteção, de controle dos aparelhos pessoais e de notificação, que precisam ser conciliadas com o uso pedagógico das tecnologias. Adesão, acomodação, adaptação, omissão seletiva, negociação, ressignificação e resistência encontram, nesse quadro, condições para aparecer, e somente as narrativas dirão quais aparecem de fato, em que condições e por quê.</w:t>
       </w:r>
     </w:p>
     <w:p>
@@ -16043,7 +15941,7 @@
         <w:rPr>
           <w:rtl w:val="0"/>
         </w:rPr>
-        <w:t>Para o objetivo (d), o capítulo reúne as promessas feitas às crianças e permite organizá-las nas três dimensões adotadas pela tese, em diálogo com o Comentário Geral nº 25 (ONU, 2021). A provisão depende dos meios que o desenho da lei deixa a cargo de cada ente. A proteção ganhou densidade com a LGPD e com o Estatuto Digital da Criança e do Adolescente, e a escolha das plataformas, quando a rede não a define, pode recair sobre a professora, junto com a responsabilidade pelos dados das crianças. A participação aparece no inciso III do art. 3º, associada ao uso consciente e democrático das tecnologias. Proteger e usar ao mesmo tempo é uma tarefa que o conjunto das normas entrega à escola sem dizer como conciliar uma coisa e outra.</w:t>
+        <w:t>Ainda para o objetivo (d), o capítulo reúne as promessas feitas às crianças e permite organizá-las nas três dimensões adotadas pela tese, em diálogo com o Comentário Geral nº 25 (ONU, 2021). A provisão depende dos meios que o desenho da lei deixa a cargo de cada ente. A proteção ganhou densidade com a LGPD e com o Estatuto Digital da Criança e do Adolescente, e a escolha das plataformas, quando a rede não a define, pode recair sobre a professora, junto com a responsabilidade pelos dados das crianças. A participação aparece no inciso III do art. 3º, associada ao uso consciente e democrático das tecnologias. Proteger e usar ao mesmo tempo é uma tarefa que o conjunto das normas entrega à escola sem dizer como conciliar uma coisa e outra.</w:t>
       </w:r>
     </w:p>
     <w:p>
@@ -16396,7 +16294,7 @@
                 <w:szCs w:val="18"/>
                 <w:rtl w:val="0"/>
               </w:rPr>
-              <w:t>Objetivo (a): delimita o espaço de interpretação em que pesam as culturas profissionais</w:t>
+              <w:t>Objetivo (b): delimita o espaço de interpretação em que pesam as culturas profissionais</w:t>
             </w:r>
           </w:p>
         </w:tc>
@@ -16543,7 +16441,7 @@
                 <w:szCs w:val="18"/>
                 <w:rtl w:val="0"/>
               </w:rPr>
-              <w:t>Objetivo (b): possibilidade de vazio material numa rede pequena; prioridade aos vulneráveis como critério de leitura</w:t>
+              <w:t>Objetivos (a) e (c): possibilidade de vazio material numa rede pequena e na distribuição dos meios entre as localidades; prioridade aos vulneráveis como critério de leitura</w:t>
             </w:r>
           </w:p>
         </w:tc>
@@ -16578,7 +16476,7 @@
                 <w:szCs w:val="18"/>
                 <w:rtl w:val="0"/>
               </w:rPr>
-              <w:t>Documentos de aquisição, conectividade e PIEC; dados fiscais do município; questionário (Bloco 3); entrevista (Eixo 3)</w:t>
+              <w:t>Documentos da Secretaria, de aquisição, conectividade e PIEC; entrevista com o técnico; dados fiscais do município; questionário (Bloco 3); entrevista (Eixo 3)</w:t>
             </w:r>
           </w:p>
         </w:tc>
@@ -16690,7 +16588,7 @@
                 <w:szCs w:val="18"/>
                 <w:rtl w:val="0"/>
               </w:rPr>
-              <w:t>Objetivos (b) e (c): o conhecimento como possível condição ausente; dimensão empírico-temporal do ineditismo</w:t>
+              <w:t>Objetivos (a) e (c): o conhecimento como possível condição ausente; dimensão empírico-temporal do ineditismo</w:t>
             </w:r>
           </w:p>
         </w:tc>
@@ -16725,7 +16623,7 @@
                 <w:szCs w:val="18"/>
                 <w:rtl w:val="0"/>
               </w:rPr>
-              <w:t>Registros de formação da Secretaria; questionário (Bloco 2); entrevista (Eixo 1)</w:t>
+              <w:t>Registros de formação da Secretaria; entrevista com o técnico; questionário (Bloco 2); entrevista (Eixo 1)</w:t>
             </w:r>
           </w:p>
         </w:tc>
@@ -16837,7 +16735,7 @@
                 <w:szCs w:val="18"/>
                 <w:rtl w:val="0"/>
               </w:rPr>
-              <w:t>Objetivo (c): possíveis exigências de registro, evidência e fabricação</w:t>
+              <w:t>Objetivo (d): possíveis exigências de registro, evidência e fabricação</w:t>
             </w:r>
           </w:p>
         </w:tc>
@@ -16984,7 +16882,7 @@
                 <w:szCs w:val="18"/>
                 <w:rtl w:val="0"/>
               </w:rPr>
-              <w:t>Objetivos (c) e (d): demandas concorrentes sobre os mesmos profissionais; escolha de plataformas e dados das crianças</w:t>
+              <w:t>Objetivo (d): demandas concorrentes sobre os mesmos profissionais; escolha de plataformas e dados das crianças</w:t>
             </w:r>
           </w:p>
         </w:tc>
@@ -17348,7 +17246,7 @@
         <w:rPr>
           <w:rtl w:val="0"/>
         </w:rPr>
-        <w:t>É sobre esse texto que os profissionais da escola produzirão sentidos, e é com ele que as formas de atuação produzidas na escola serão comparadas no Capítulo 7. Antes disso, o Capítulo 6 caracteriza o território de Pipa e a escola onde essa promessa encontra crianças e profissionais concretos.</w:t>
+        <w:t>É sobre esse texto que a Secretaria e os profissionais da escola produzirão sentidos, e é com ele que as formas de atuação produzidas na escola serão comparadas no Capítulo 7. Antes disso, o Capítulo 6 percorre o território municipal, a rede e a Secretaria diante da PNED, Pipa e a escola onde essa promessa encontra crianças e profissionais concretos.</w:t>
       </w:r>
     </w:p>
     <w:p>

</xml_diff>